<commit_message>
Add docs from luciana
</commit_message>
<xml_diff>
--- a/Docs/Observaciones-Lab8.docx
+++ b/Docs/Observaciones-Lab8.docx
@@ -118,18 +118,16 @@
     </w:p>
     <w:p>
       <w:pPr>
-        <w:spacing w:after="106"/>
-        <w:ind w:left="35"/>
-        <w:rPr>
-          <w:lang w:val="es-CO"/>
-        </w:rPr>
-      </w:pPr>
-      <w:r>
-        <w:rPr>
-          <w:rFonts w:ascii="Arial" w:eastAsia="Arial" w:hAnsi="Arial" w:cs="Arial"/>
+        <w:rPr>
           <w:b/>
-          <w:color w:val="2F4F9E"/>
-          <w:sz w:val="25"/>
+          <w:bCs/>
+          <w:lang w:val="es-CO"/>
+        </w:rPr>
+      </w:pPr>
+      <w:r>
+        <w:rPr>
+          <w:b/>
+          <w:bCs/>
           <w:lang w:val="es-CO"/>
         </w:rPr>
         <w:t>Datos de la ejecución</w:t>
@@ -137,58 +135,84 @@
     </w:p>
     <w:p>
       <w:pPr>
-        <w:spacing w:after="0"/>
-        <w:ind w:left="35"/>
-        <w:rPr>
-          <w:lang w:val="es-CO"/>
-        </w:rPr>
-      </w:pPr>
-      <w:r>
-        <w:rPr>
-          <w:lang w:val="es-CO"/>
-        </w:rPr>
-        <w:t>Se cargaron 319073 crímenes del conjunto Boston Crimes. Los resultados del RBT y los del BST del laboratorio anterior se comparan en la siguiente tabla.</w:t>
+        <w:rPr>
+          <w:lang w:val="es-CO"/>
+        </w:rPr>
+      </w:pPr>
+      <w:r>
+        <w:rPr>
+          <w:lang w:val="es-CO"/>
+        </w:rPr>
+        <w:t>Se cargaron </w:t>
+      </w:r>
+      <w:r>
+        <w:rPr>
+          <w:b/>
+          <w:bCs/>
+          <w:lang w:val="es-CO"/>
+        </w:rPr>
+        <w:t>319073 crímenes</w:t>
+      </w:r>
+      <w:r>
+        <w:rPr>
+          <w:lang w:val="es-CO"/>
+        </w:rPr>
+        <w:t> del conjunto de datos Boston Crimes. Los resultados del árbol rojo-negro (RBT) y del árbol binario de búsqueda (BST) del laboratorio anterior se comparan en la siguiente tabla.</w:t>
       </w:r>
     </w:p>
     <w:tbl>
       <w:tblPr>
-        <w:tblStyle w:val="TableGrid"/>
-        <w:tblW w:w="9216" w:type="dxa"/>
-        <w:tblInd w:w="136" w:type="dxa"/>
+        <w:tblW w:w="0" w:type="auto"/>
+        <w:tblBorders>
+          <w:top w:val="single" w:sz="4" w:space="0" w:color="auto"/>
+          <w:left w:val="single" w:sz="4" w:space="0" w:color="auto"/>
+          <w:bottom w:val="single" w:sz="4" w:space="0" w:color="auto"/>
+          <w:right w:val="single" w:sz="4" w:space="0" w:color="auto"/>
+          <w:insideH w:val="single" w:sz="4" w:space="0" w:color="auto"/>
+          <w:insideV w:val="single" w:sz="4" w:space="0" w:color="auto"/>
+        </w:tblBorders>
         <w:tblCellMar>
-          <w:top w:w="134" w:type="dxa"/>
-          <w:left w:w="120" w:type="dxa"/>
-          <w:right w:w="115" w:type="dxa"/>
+          <w:top w:w="15" w:type="dxa"/>
+          <w:left w:w="15" w:type="dxa"/>
+          <w:bottom w:w="15" w:type="dxa"/>
+          <w:right w:w="15" w:type="dxa"/>
         </w:tblCellMar>
         <w:tblLook w:val="04A0" w:firstRow="1" w:lastRow="0" w:firstColumn="1" w:lastColumn="0" w:noHBand="0" w:noVBand="1"/>
       </w:tblPr>
       <w:tblGrid>
-        <w:gridCol w:w="4320"/>
-        <w:gridCol w:w="2448"/>
-        <w:gridCol w:w="2448"/>
+        <w:gridCol w:w="3227"/>
+        <w:gridCol w:w="1304"/>
+        <w:gridCol w:w="1324"/>
       </w:tblGrid>
       <w:tr>
         <w:trPr>
-          <w:trHeight w:val="400"/>
+          <w:tblHeader/>
         </w:trPr>
         <w:tc>
           <w:tcPr>
-            <w:tcW w:w="4320" w:type="dxa"/>
-            <w:tcBorders>
-              <w:top w:val="single" w:sz="4" w:space="0" w:color="999999"/>
-              <w:left w:val="single" w:sz="4" w:space="0" w:color="999999"/>
-              <w:bottom w:val="single" w:sz="4" w:space="0" w:color="999999"/>
-              <w:right w:val="single" w:sz="4" w:space="0" w:color="999999"/>
-            </w:tcBorders>
-            <w:shd w:val="clear" w:color="auto" w:fill="2F4F9E"/>
+            <w:tcW w:w="0" w:type="auto"/>
+            <w:tcMar>
+              <w:top w:w="75" w:type="dxa"/>
+              <w:left w:w="150" w:type="dxa"/>
+              <w:bottom w:w="75" w:type="dxa"/>
+              <w:right w:w="150" w:type="dxa"/>
+            </w:tcMar>
+            <w:vAlign w:val="center"/>
+            <w:hideMark/>
           </w:tcPr>
           <w:p>
+            <w:pPr>
+              <w:rPr>
+                <w:b/>
+                <w:bCs/>
+                <w:lang w:val="es-CO"/>
+              </w:rPr>
+            </w:pPr>
             <w:r>
               <w:rPr>
-                <w:rFonts w:ascii="Arial" w:eastAsia="Arial" w:hAnsi="Arial" w:cs="Arial"/>
                 <w:b/>
-                <w:color w:val="FFFFFF"/>
-                <w:sz w:val="19"/>
+                <w:bCs/>
+                <w:lang w:val="es-CO"/>
               </w:rPr>
               <w:t>Métrica</w:t>
             </w:r>
@@ -196,70 +220,123 @@
         </w:tc>
         <w:tc>
           <w:tcPr>
-            <w:tcW w:w="2448" w:type="dxa"/>
-            <w:tcBorders>
-              <w:top w:val="single" w:sz="4" w:space="0" w:color="999999"/>
-              <w:left w:val="single" w:sz="4" w:space="0" w:color="999999"/>
-              <w:bottom w:val="single" w:sz="4" w:space="0" w:color="999999"/>
-              <w:right w:val="single" w:sz="4" w:space="0" w:color="999999"/>
-            </w:tcBorders>
-            <w:shd w:val="clear" w:color="auto" w:fill="2F4F9E"/>
+            <w:tcW w:w="0" w:type="auto"/>
+            <w:tcMar>
+              <w:top w:w="75" w:type="dxa"/>
+              <w:left w:w="150" w:type="dxa"/>
+              <w:bottom w:w="75" w:type="dxa"/>
+              <w:right w:w="150" w:type="dxa"/>
+            </w:tcMar>
+            <w:vAlign w:val="center"/>
+            <w:hideMark/>
           </w:tcPr>
           <w:p>
+            <w:pPr>
+              <w:rPr>
+                <w:b/>
+                <w:bCs/>
+                <w:lang w:val="es-CO"/>
+              </w:rPr>
+            </w:pPr>
             <w:r>
               <w:rPr>
-                <w:rFonts w:ascii="Arial" w:eastAsia="Arial" w:hAnsi="Arial" w:cs="Arial"/>
                 <w:b/>
-                <w:color w:val="FFFFFF"/>
-                <w:sz w:val="19"/>
-              </w:rPr>
-              <w:t>BST (Lab 7)</w:t>
+                <w:bCs/>
+                <w:lang w:val="es-CO"/>
+              </w:rPr>
+              <w:t>BST (</w:t>
+            </w:r>
+            <w:proofErr w:type="spellStart"/>
+            <w:r>
+              <w:rPr>
+                <w:b/>
+                <w:bCs/>
+                <w:lang w:val="es-CO"/>
+              </w:rPr>
+              <w:t>Lab</w:t>
+            </w:r>
+            <w:proofErr w:type="spellEnd"/>
+            <w:r>
+              <w:rPr>
+                <w:b/>
+                <w:bCs/>
+                <w:lang w:val="es-CO"/>
+              </w:rPr>
+              <w:t xml:space="preserve"> 7)</w:t>
             </w:r>
           </w:p>
         </w:tc>
         <w:tc>
           <w:tcPr>
-            <w:tcW w:w="2448" w:type="dxa"/>
-            <w:tcBorders>
-              <w:top w:val="single" w:sz="4" w:space="0" w:color="999999"/>
-              <w:left w:val="single" w:sz="4" w:space="0" w:color="999999"/>
-              <w:bottom w:val="single" w:sz="4" w:space="0" w:color="999999"/>
-              <w:right w:val="single" w:sz="4" w:space="0" w:color="999999"/>
-            </w:tcBorders>
-            <w:shd w:val="clear" w:color="auto" w:fill="2F4F9E"/>
+            <w:tcW w:w="0" w:type="auto"/>
+            <w:tcMar>
+              <w:top w:w="75" w:type="dxa"/>
+              <w:left w:w="150" w:type="dxa"/>
+              <w:bottom w:w="75" w:type="dxa"/>
+              <w:right w:w="150" w:type="dxa"/>
+            </w:tcMar>
+            <w:vAlign w:val="center"/>
+            <w:hideMark/>
           </w:tcPr>
           <w:p>
+            <w:pPr>
+              <w:rPr>
+                <w:b/>
+                <w:bCs/>
+                <w:lang w:val="es-CO"/>
+              </w:rPr>
+            </w:pPr>
             <w:r>
               <w:rPr>
-                <w:rFonts w:ascii="Arial" w:eastAsia="Arial" w:hAnsi="Arial" w:cs="Arial"/>
                 <w:b/>
-                <w:color w:val="FFFFFF"/>
-                <w:sz w:val="19"/>
-              </w:rPr>
-              <w:t>RBT (Lab 8)</w:t>
+                <w:bCs/>
+                <w:lang w:val="es-CO"/>
+              </w:rPr>
+              <w:t>RBT (</w:t>
+            </w:r>
+            <w:proofErr w:type="spellStart"/>
+            <w:r>
+              <w:rPr>
+                <w:b/>
+                <w:bCs/>
+                <w:lang w:val="es-CO"/>
+              </w:rPr>
+              <w:t>Lab</w:t>
+            </w:r>
+            <w:proofErr w:type="spellEnd"/>
+            <w:r>
+              <w:rPr>
+                <w:b/>
+                <w:bCs/>
+                <w:lang w:val="es-CO"/>
+              </w:rPr>
+              <w:t xml:space="preserve"> 8)</w:t>
             </w:r>
           </w:p>
         </w:tc>
       </w:tr>
       <w:tr>
-        <w:trPr>
-          <w:trHeight w:val="400"/>
-        </w:trPr>
         <w:tc>
           <w:tcPr>
-            <w:tcW w:w="4320" w:type="dxa"/>
-            <w:tcBorders>
-              <w:top w:val="single" w:sz="4" w:space="0" w:color="999999"/>
-              <w:left w:val="single" w:sz="4" w:space="0" w:color="999999"/>
-              <w:bottom w:val="single" w:sz="4" w:space="0" w:color="999999"/>
-              <w:right w:val="single" w:sz="4" w:space="0" w:color="999999"/>
-            </w:tcBorders>
-            <w:shd w:val="clear" w:color="auto" w:fill="FFFFFF"/>
+            <w:tcW w:w="0" w:type="auto"/>
+            <w:tcMar>
+              <w:top w:w="75" w:type="dxa"/>
+              <w:left w:w="150" w:type="dxa"/>
+              <w:bottom w:w="75" w:type="dxa"/>
+              <w:right w:w="150" w:type="dxa"/>
+            </w:tcMar>
+            <w:vAlign w:val="center"/>
+            <w:hideMark/>
           </w:tcPr>
           <w:p>
+            <w:pPr>
+              <w:rPr>
+                <w:lang w:val="es-CO"/>
+              </w:rPr>
+            </w:pPr>
             <w:r>
               <w:rPr>
-                <w:sz w:val="19"/>
+                <w:lang w:val="es-CO"/>
               </w:rPr>
               <w:t>Altura del árbol por fechas</w:t>
             </w:r>
@@ -267,39 +344,211 @@
         </w:tc>
         <w:tc>
           <w:tcPr>
-            <w:tcW w:w="2448" w:type="dxa"/>
-            <w:tcBorders>
-              <w:top w:val="single" w:sz="4" w:space="0" w:color="999999"/>
-              <w:left w:val="single" w:sz="4" w:space="0" w:color="999999"/>
-              <w:bottom w:val="single" w:sz="4" w:space="0" w:color="999999"/>
-              <w:right w:val="single" w:sz="4" w:space="0" w:color="999999"/>
-            </w:tcBorders>
-            <w:shd w:val="clear" w:color="auto" w:fill="FFFFFF"/>
+            <w:tcW w:w="0" w:type="auto"/>
+            <w:tcMar>
+              <w:top w:w="75" w:type="dxa"/>
+              <w:left w:w="150" w:type="dxa"/>
+              <w:bottom w:w="75" w:type="dxa"/>
+              <w:right w:w="150" w:type="dxa"/>
+            </w:tcMar>
+            <w:vAlign w:val="center"/>
+            <w:hideMark/>
           </w:tcPr>
           <w:p>
+            <w:pPr>
+              <w:rPr>
+                <w:lang w:val="es-CO"/>
+              </w:rPr>
+            </w:pPr>
             <w:r>
               <w:rPr>
-                <w:sz w:val="19"/>
-              </w:rPr>
-              <w:t>[ ]</w:t>
+                <w:lang w:val="es-CO"/>
+              </w:rPr>
+              <w:t>30</w:t>
             </w:r>
           </w:p>
         </w:tc>
         <w:tc>
           <w:tcPr>
-            <w:tcW w:w="2448" w:type="dxa"/>
-            <w:tcBorders>
-              <w:top w:val="single" w:sz="4" w:space="0" w:color="999999"/>
-              <w:left w:val="single" w:sz="4" w:space="0" w:color="999999"/>
-              <w:bottom w:val="single" w:sz="4" w:space="0" w:color="999999"/>
-              <w:right w:val="single" w:sz="4" w:space="0" w:color="999999"/>
-            </w:tcBorders>
-            <w:shd w:val="clear" w:color="auto" w:fill="FFFFFF"/>
+            <w:tcW w:w="0" w:type="auto"/>
+            <w:tcMar>
+              <w:top w:w="75" w:type="dxa"/>
+              <w:left w:w="150" w:type="dxa"/>
+              <w:bottom w:w="75" w:type="dxa"/>
+              <w:right w:w="150" w:type="dxa"/>
+            </w:tcMar>
+            <w:vAlign w:val="center"/>
+            <w:hideMark/>
           </w:tcPr>
           <w:p>
+            <w:pPr>
+              <w:rPr>
+                <w:lang w:val="es-CO"/>
+              </w:rPr>
+            </w:pPr>
             <w:r>
               <w:rPr>
-                <w:sz w:val="19"/>
+                <w:lang w:val="es-CO"/>
+              </w:rPr>
+              <w:t>14</w:t>
+            </w:r>
+          </w:p>
+        </w:tc>
+      </w:tr>
+      <w:tr>
+        <w:tc>
+          <w:tcPr>
+            <w:tcW w:w="0" w:type="auto"/>
+            <w:tcMar>
+              <w:top w:w="75" w:type="dxa"/>
+              <w:left w:w="150" w:type="dxa"/>
+              <w:bottom w:w="75" w:type="dxa"/>
+              <w:right w:w="150" w:type="dxa"/>
+            </w:tcMar>
+            <w:vAlign w:val="center"/>
+            <w:hideMark/>
+          </w:tcPr>
+          <w:p>
+            <w:pPr>
+              <w:rPr>
+                <w:lang w:val="es-CO"/>
+              </w:rPr>
+            </w:pPr>
+            <w:r>
+              <w:rPr>
+                <w:lang w:val="es-CO"/>
+              </w:rPr>
+              <w:t>Elementos en el árbol por fechas</w:t>
+            </w:r>
+          </w:p>
+        </w:tc>
+        <w:tc>
+          <w:tcPr>
+            <w:tcW w:w="0" w:type="auto"/>
+            <w:tcMar>
+              <w:top w:w="75" w:type="dxa"/>
+              <w:left w:w="150" w:type="dxa"/>
+              <w:bottom w:w="75" w:type="dxa"/>
+              <w:right w:w="150" w:type="dxa"/>
+            </w:tcMar>
+            <w:vAlign w:val="center"/>
+            <w:hideMark/>
+          </w:tcPr>
+          <w:p>
+            <w:pPr>
+              <w:rPr>
+                <w:lang w:val="es-CO"/>
+              </w:rPr>
+            </w:pPr>
+            <w:r>
+              <w:rPr>
+                <w:lang w:val="es-CO"/>
+              </w:rPr>
+              <w:t>1177</w:t>
+            </w:r>
+          </w:p>
+        </w:tc>
+        <w:tc>
+          <w:tcPr>
+            <w:tcW w:w="0" w:type="auto"/>
+            <w:tcMar>
+              <w:top w:w="75" w:type="dxa"/>
+              <w:left w:w="150" w:type="dxa"/>
+              <w:bottom w:w="75" w:type="dxa"/>
+              <w:right w:w="150" w:type="dxa"/>
+            </w:tcMar>
+            <w:vAlign w:val="center"/>
+            <w:hideMark/>
+          </w:tcPr>
+          <w:p>
+            <w:pPr>
+              <w:rPr>
+                <w:lang w:val="es-CO"/>
+              </w:rPr>
+            </w:pPr>
+            <w:r>
+              <w:rPr>
+                <w:lang w:val="es-CO"/>
+              </w:rPr>
+              <w:t>1177</w:t>
+            </w:r>
+          </w:p>
+        </w:tc>
+      </w:tr>
+      <w:tr>
+        <w:tc>
+          <w:tcPr>
+            <w:tcW w:w="0" w:type="auto"/>
+            <w:tcMar>
+              <w:top w:w="75" w:type="dxa"/>
+              <w:left w:w="150" w:type="dxa"/>
+              <w:bottom w:w="75" w:type="dxa"/>
+              <w:right w:w="150" w:type="dxa"/>
+            </w:tcMar>
+            <w:vAlign w:val="center"/>
+            <w:hideMark/>
+          </w:tcPr>
+          <w:p>
+            <w:pPr>
+              <w:rPr>
+                <w:lang w:val="es-CO"/>
+              </w:rPr>
+            </w:pPr>
+            <w:r>
+              <w:rPr>
+                <w:lang w:val="es-CO"/>
+              </w:rPr>
+              <w:t>Altura del árbol por áreas</w:t>
+            </w:r>
+          </w:p>
+        </w:tc>
+        <w:tc>
+          <w:tcPr>
+            <w:tcW w:w="0" w:type="auto"/>
+            <w:tcMar>
+              <w:top w:w="75" w:type="dxa"/>
+              <w:left w:w="150" w:type="dxa"/>
+              <w:bottom w:w="75" w:type="dxa"/>
+              <w:right w:w="150" w:type="dxa"/>
+            </w:tcMar>
+            <w:vAlign w:val="center"/>
+            <w:hideMark/>
+          </w:tcPr>
+          <w:p>
+            <w:pPr>
+              <w:rPr>
+                <w:lang w:val="es-CO"/>
+              </w:rPr>
+            </w:pPr>
+            <w:r>
+              <w:rPr>
+                <w:lang w:val="es-CO"/>
+              </w:rPr>
+              <w:t>20</w:t>
+            </w:r>
+          </w:p>
+        </w:tc>
+        <w:tc>
+          <w:tcPr>
+            <w:tcW w:w="0" w:type="auto"/>
+            <w:tcMar>
+              <w:top w:w="75" w:type="dxa"/>
+              <w:left w:w="150" w:type="dxa"/>
+              <w:bottom w:w="75" w:type="dxa"/>
+              <w:right w:w="150" w:type="dxa"/>
+            </w:tcMar>
+            <w:vAlign w:val="center"/>
+            <w:hideMark/>
+          </w:tcPr>
+          <w:p>
+            <w:pPr>
+              <w:rPr>
+                <w:lang w:val="es-CO"/>
+              </w:rPr>
+            </w:pPr>
+            <w:r>
+              <w:rPr>
+                <w:lang w:val="es-CO"/>
               </w:rPr>
               <w:t>13</w:t>
             </w:r>
@@ -307,154 +556,27 @@
         </w:tc>
       </w:tr>
       <w:tr>
-        <w:trPr>
-          <w:trHeight w:val="400"/>
-        </w:trPr>
         <w:tc>
           <w:tcPr>
-            <w:tcW w:w="4320" w:type="dxa"/>
-            <w:tcBorders>
-              <w:top w:val="single" w:sz="4" w:space="0" w:color="999999"/>
-              <w:left w:val="single" w:sz="4" w:space="0" w:color="999999"/>
-              <w:bottom w:val="single" w:sz="4" w:space="0" w:color="999999"/>
-              <w:right w:val="single" w:sz="4" w:space="0" w:color="999999"/>
-            </w:tcBorders>
-            <w:shd w:val="clear" w:color="auto" w:fill="EEF2FA"/>
+            <w:tcW w:w="0" w:type="auto"/>
+            <w:tcMar>
+              <w:top w:w="75" w:type="dxa"/>
+              <w:left w:w="150" w:type="dxa"/>
+              <w:bottom w:w="75" w:type="dxa"/>
+              <w:right w:w="150" w:type="dxa"/>
+            </w:tcMar>
+            <w:vAlign w:val="center"/>
+            <w:hideMark/>
           </w:tcPr>
           <w:p>
+            <w:pPr>
+              <w:rPr>
+                <w:lang w:val="es-CO"/>
+              </w:rPr>
+            </w:pPr>
             <w:r>
               <w:rPr>
-                <w:sz w:val="19"/>
-              </w:rPr>
-              <w:t>Elementos en el árbol por fechas</w:t>
-            </w:r>
-          </w:p>
-        </w:tc>
-        <w:tc>
-          <w:tcPr>
-            <w:tcW w:w="2448" w:type="dxa"/>
-            <w:tcBorders>
-              <w:top w:val="single" w:sz="4" w:space="0" w:color="999999"/>
-              <w:left w:val="single" w:sz="4" w:space="0" w:color="999999"/>
-              <w:bottom w:val="single" w:sz="4" w:space="0" w:color="999999"/>
-              <w:right w:val="single" w:sz="4" w:space="0" w:color="999999"/>
-            </w:tcBorders>
-            <w:shd w:val="clear" w:color="auto" w:fill="EEF2FA"/>
-          </w:tcPr>
-          <w:p>
-            <w:r>
-              <w:rPr>
-                <w:sz w:val="19"/>
-              </w:rPr>
-              <w:t>1177</w:t>
-            </w:r>
-          </w:p>
-        </w:tc>
-        <w:tc>
-          <w:tcPr>
-            <w:tcW w:w="2448" w:type="dxa"/>
-            <w:tcBorders>
-              <w:top w:val="single" w:sz="4" w:space="0" w:color="999999"/>
-              <w:left w:val="single" w:sz="4" w:space="0" w:color="999999"/>
-              <w:bottom w:val="single" w:sz="4" w:space="0" w:color="999999"/>
-              <w:right w:val="single" w:sz="4" w:space="0" w:color="999999"/>
-            </w:tcBorders>
-            <w:shd w:val="clear" w:color="auto" w:fill="EEF2FA"/>
-          </w:tcPr>
-          <w:p>
-            <w:r>
-              <w:rPr>
-                <w:sz w:val="19"/>
-              </w:rPr>
-              <w:t>1177</w:t>
-            </w:r>
-          </w:p>
-        </w:tc>
-      </w:tr>
-      <w:tr>
-        <w:trPr>
-          <w:trHeight w:val="400"/>
-        </w:trPr>
-        <w:tc>
-          <w:tcPr>
-            <w:tcW w:w="4320" w:type="dxa"/>
-            <w:tcBorders>
-              <w:top w:val="single" w:sz="4" w:space="0" w:color="999999"/>
-              <w:left w:val="single" w:sz="4" w:space="0" w:color="999999"/>
-              <w:bottom w:val="single" w:sz="4" w:space="0" w:color="999999"/>
-              <w:right w:val="single" w:sz="4" w:space="0" w:color="999999"/>
-            </w:tcBorders>
-            <w:shd w:val="clear" w:color="auto" w:fill="FFFFFF"/>
-          </w:tcPr>
-          <w:p>
-            <w:r>
-              <w:rPr>
-                <w:sz w:val="19"/>
-              </w:rPr>
-              <w:t>Altura del árbol por áreas</w:t>
-            </w:r>
-          </w:p>
-        </w:tc>
-        <w:tc>
-          <w:tcPr>
-            <w:tcW w:w="2448" w:type="dxa"/>
-            <w:tcBorders>
-              <w:top w:val="single" w:sz="4" w:space="0" w:color="999999"/>
-              <w:left w:val="single" w:sz="4" w:space="0" w:color="999999"/>
-              <w:bottom w:val="single" w:sz="4" w:space="0" w:color="999999"/>
-              <w:right w:val="single" w:sz="4" w:space="0" w:color="999999"/>
-            </w:tcBorders>
-            <w:shd w:val="clear" w:color="auto" w:fill="FFFFFF"/>
-          </w:tcPr>
-          <w:p>
-            <w:r>
-              <w:rPr>
-                <w:sz w:val="19"/>
-              </w:rPr>
-              <w:t>[ ]</w:t>
-            </w:r>
-          </w:p>
-        </w:tc>
-        <w:tc>
-          <w:tcPr>
-            <w:tcW w:w="2448" w:type="dxa"/>
-            <w:tcBorders>
-              <w:top w:val="single" w:sz="4" w:space="0" w:color="999999"/>
-              <w:left w:val="single" w:sz="4" w:space="0" w:color="999999"/>
-              <w:bottom w:val="single" w:sz="4" w:space="0" w:color="999999"/>
-              <w:right w:val="single" w:sz="4" w:space="0" w:color="999999"/>
-            </w:tcBorders>
-            <w:shd w:val="clear" w:color="auto" w:fill="FFFFFF"/>
-          </w:tcPr>
-          <w:p>
-            <w:r>
-              <w:rPr>
-                <w:sz w:val="19"/>
-              </w:rPr>
-              <w:t>12</w:t>
-            </w:r>
-          </w:p>
-        </w:tc>
-      </w:tr>
-      <w:tr>
-        <w:trPr>
-          <w:trHeight w:val="400"/>
-        </w:trPr>
-        <w:tc>
-          <w:tcPr>
-            <w:tcW w:w="4320" w:type="dxa"/>
-            <w:tcBorders>
-              <w:top w:val="single" w:sz="4" w:space="0" w:color="999999"/>
-              <w:left w:val="single" w:sz="4" w:space="0" w:color="999999"/>
-              <w:bottom w:val="single" w:sz="4" w:space="0" w:color="999999"/>
-              <w:right w:val="single" w:sz="4" w:space="0" w:color="999999"/>
-            </w:tcBorders>
-            <w:shd w:val="clear" w:color="auto" w:fill="EEF2FA"/>
-          </w:tcPr>
-          <w:p>
-            <w:r>
-              <w:rPr>
-                <w:sz w:val="19"/>
+                <w:lang w:val="es-CO"/>
               </w:rPr>
               <w:t>Elementos en el árbol por áreas</w:t>
             </w:r>
@@ -462,19 +584,25 @@
         </w:tc>
         <w:tc>
           <w:tcPr>
-            <w:tcW w:w="2448" w:type="dxa"/>
-            <w:tcBorders>
-              <w:top w:val="single" w:sz="4" w:space="0" w:color="999999"/>
-              <w:left w:val="single" w:sz="4" w:space="0" w:color="999999"/>
-              <w:bottom w:val="single" w:sz="4" w:space="0" w:color="999999"/>
-              <w:right w:val="single" w:sz="4" w:space="0" w:color="999999"/>
-            </w:tcBorders>
-            <w:shd w:val="clear" w:color="auto" w:fill="EEF2FA"/>
+            <w:tcW w:w="0" w:type="auto"/>
+            <w:tcMar>
+              <w:top w:w="75" w:type="dxa"/>
+              <w:left w:w="150" w:type="dxa"/>
+              <w:bottom w:w="75" w:type="dxa"/>
+              <w:right w:w="150" w:type="dxa"/>
+            </w:tcMar>
+            <w:vAlign w:val="center"/>
+            <w:hideMark/>
           </w:tcPr>
           <w:p>
+            <w:pPr>
+              <w:rPr>
+                <w:lang w:val="es-CO"/>
+              </w:rPr>
+            </w:pPr>
             <w:r>
               <w:rPr>
-                <w:sz w:val="19"/>
+                <w:lang w:val="es-CO"/>
               </w:rPr>
               <w:t>879</w:t>
             </w:r>
@@ -482,19 +610,25 @@
         </w:tc>
         <w:tc>
           <w:tcPr>
-            <w:tcW w:w="2448" w:type="dxa"/>
-            <w:tcBorders>
-              <w:top w:val="single" w:sz="4" w:space="0" w:color="999999"/>
-              <w:left w:val="single" w:sz="4" w:space="0" w:color="999999"/>
-              <w:bottom w:val="single" w:sz="4" w:space="0" w:color="999999"/>
-              <w:right w:val="single" w:sz="4" w:space="0" w:color="999999"/>
-            </w:tcBorders>
-            <w:shd w:val="clear" w:color="auto" w:fill="EEF2FA"/>
+            <w:tcW w:w="0" w:type="auto"/>
+            <w:tcMar>
+              <w:top w:w="75" w:type="dxa"/>
+              <w:left w:w="150" w:type="dxa"/>
+              <w:bottom w:w="75" w:type="dxa"/>
+              <w:right w:w="150" w:type="dxa"/>
+            </w:tcMar>
+            <w:vAlign w:val="center"/>
+            <w:hideMark/>
           </w:tcPr>
           <w:p>
+            <w:pPr>
+              <w:rPr>
+                <w:lang w:val="es-CO"/>
+              </w:rPr>
+            </w:pPr>
             <w:r>
               <w:rPr>
-                <w:sz w:val="19"/>
+                <w:lang w:val="es-CO"/>
               </w:rPr>
               <w:t>879</w:t>
             </w:r>
@@ -502,24 +636,27 @@
         </w:tc>
       </w:tr>
       <w:tr>
-        <w:trPr>
-          <w:trHeight w:val="400"/>
-        </w:trPr>
         <w:tc>
           <w:tcPr>
-            <w:tcW w:w="4320" w:type="dxa"/>
-            <w:tcBorders>
-              <w:top w:val="single" w:sz="4" w:space="0" w:color="999999"/>
-              <w:left w:val="single" w:sz="4" w:space="0" w:color="999999"/>
-              <w:bottom w:val="single" w:sz="4" w:space="0" w:color="999999"/>
-              <w:right w:val="single" w:sz="4" w:space="0" w:color="999999"/>
-            </w:tcBorders>
-            <w:shd w:val="clear" w:color="auto" w:fill="FFFFFF"/>
+            <w:tcW w:w="0" w:type="auto"/>
+            <w:tcMar>
+              <w:top w:w="75" w:type="dxa"/>
+              <w:left w:w="150" w:type="dxa"/>
+              <w:bottom w:w="75" w:type="dxa"/>
+              <w:right w:w="150" w:type="dxa"/>
+            </w:tcMar>
+            <w:vAlign w:val="center"/>
+            <w:hideMark/>
           </w:tcPr>
           <w:p>
+            <w:pPr>
+              <w:rPr>
+                <w:lang w:val="es-CO"/>
+              </w:rPr>
+            </w:pPr>
             <w:r>
               <w:rPr>
-                <w:sz w:val="19"/>
+                <w:lang w:val="es-CO"/>
               </w:rPr>
               <w:t>Tiempo de carga (ms)</w:t>
             </w:r>
@@ -527,41 +664,53 @@
         </w:tc>
         <w:tc>
           <w:tcPr>
-            <w:tcW w:w="2448" w:type="dxa"/>
-            <w:tcBorders>
-              <w:top w:val="single" w:sz="4" w:space="0" w:color="999999"/>
-              <w:left w:val="single" w:sz="4" w:space="0" w:color="999999"/>
-              <w:bottom w:val="single" w:sz="4" w:space="0" w:color="999999"/>
-              <w:right w:val="single" w:sz="4" w:space="0" w:color="999999"/>
-            </w:tcBorders>
-            <w:shd w:val="clear" w:color="auto" w:fill="FFFFFF"/>
+            <w:tcW w:w="0" w:type="auto"/>
+            <w:tcMar>
+              <w:top w:w="75" w:type="dxa"/>
+              <w:left w:w="150" w:type="dxa"/>
+              <w:bottom w:w="75" w:type="dxa"/>
+              <w:right w:w="150" w:type="dxa"/>
+            </w:tcMar>
+            <w:vAlign w:val="center"/>
+            <w:hideMark/>
           </w:tcPr>
           <w:p>
+            <w:pPr>
+              <w:rPr>
+                <w:lang w:val="es-CO"/>
+              </w:rPr>
+            </w:pPr>
             <w:r>
               <w:rPr>
-                <w:sz w:val="19"/>
-              </w:rPr>
-              <w:t>[ ]</w:t>
+                <w:lang w:val="es-CO"/>
+              </w:rPr>
+              <w:t>14455.53</w:t>
             </w:r>
           </w:p>
         </w:tc>
         <w:tc>
           <w:tcPr>
-            <w:tcW w:w="2448" w:type="dxa"/>
-            <w:tcBorders>
-              <w:top w:val="single" w:sz="4" w:space="0" w:color="999999"/>
-              <w:left w:val="single" w:sz="4" w:space="0" w:color="999999"/>
-              <w:bottom w:val="single" w:sz="4" w:space="0" w:color="999999"/>
-              <w:right w:val="single" w:sz="4" w:space="0" w:color="999999"/>
-            </w:tcBorders>
-            <w:shd w:val="clear" w:color="auto" w:fill="FFFFFF"/>
+            <w:tcW w:w="0" w:type="auto"/>
+            <w:tcMar>
+              <w:top w:w="75" w:type="dxa"/>
+              <w:left w:w="150" w:type="dxa"/>
+              <w:bottom w:w="75" w:type="dxa"/>
+              <w:right w:w="150" w:type="dxa"/>
+            </w:tcMar>
+            <w:vAlign w:val="center"/>
+            <w:hideMark/>
           </w:tcPr>
           <w:p>
+            <w:pPr>
+              <w:rPr>
+                <w:lang w:val="es-CO"/>
+              </w:rPr>
+            </w:pPr>
             <w:r>
               <w:rPr>
-                <w:sz w:val="19"/>
-              </w:rPr>
-              <w:t>[ ]</w:t>
+                <w:lang w:val="es-CO"/>
+              </w:rPr>
+              <w:t>14316.39</w:t>
             </w:r>
           </w:p>
         </w:tc>
@@ -569,291 +718,362 @@
     </w:tbl>
     <w:p>
       <w:pPr>
+        <w:rPr>
+          <w:lang w:val="es-CO"/>
+        </w:rPr>
+      </w:pPr>
+      <w:r>
+        <w:rPr>
+          <w:lang w:val="es-CO"/>
+        </w:rPr>
+        <w:t>Los tiempos dependen del equipo, del estado del sistema y de la implementación utilizada. Por esta razón, deben interpretarse como una referencia experimental y no como valores absolutos.</w:t>
+      </w:r>
+    </w:p>
+    <w:p>
+      <w:pPr>
+        <w:rPr>
+          <w:b/>
+          <w:bCs/>
+          <w:lang w:val="es-CO"/>
+        </w:rPr>
+      </w:pPr>
+      <w:r>
+        <w:rPr>
+          <w:b/>
+          <w:bCs/>
+          <w:lang w:val="es-CO"/>
+        </w:rPr>
+        <w:t>a. ¿Qué diferencia existe entre las alturas de los dos árboles (BST y RBT)?</w:t>
+      </w:r>
+    </w:p>
+    <w:p>
+      <w:pPr>
+        <w:rPr>
+          <w:lang w:val="es-CO"/>
+        </w:rPr>
+      </w:pPr>
+      <w:r>
+        <w:rPr>
+          <w:lang w:val="es-CO"/>
+        </w:rPr>
+        <w:t>La altura del RBT es considerablemente menor que la del BST para los mismos datos. Esto ocurre porque el RBT se mantiene balanceado mediante rotaciones y cambios de color después de las inserciones.</w:t>
+      </w:r>
+    </w:p>
+    <w:p>
+      <w:pPr>
+        <w:rPr>
+          <w:lang w:val="es-CO"/>
+        </w:rPr>
+      </w:pPr>
+      <w:r>
+        <w:rPr>
+          <w:lang w:val="es-CO"/>
+        </w:rPr>
+        <w:t>En un BST tradicional, la altura depende completamente del orden en que se insertan las llaves. Si las llaves llegan en un orden desfavorable, el árbol puede quedar desbalanceado y acercarse a una estructura lineal. En ese caso, la altura puede llegar a ser del orden de (N).</w:t>
+      </w:r>
+    </w:p>
+    <w:p>
+      <w:pPr>
+        <w:rPr>
+          <w:lang w:val="es-CO"/>
+        </w:rPr>
+      </w:pPr>
+      <w:r>
+        <w:rPr>
+          <w:lang w:val="es-CO"/>
+        </w:rPr>
+        <w:t>Por el contrario, el RBT mantiene una altura acotada por una función logarítmica</w:t>
+      </w:r>
+    </w:p>
+    <w:p>
+      <w:pPr>
+        <w:rPr>
+          <w:lang w:val="es-CO"/>
+        </w:rPr>
+      </w:pPr>
+      <w:r>
+        <w:rPr>
+          <w:lang w:val="es-CO"/>
+        </w:rPr>
+        <w:t>Para el índice de fechas se obtuvieron 1177 llaves distintas. El BST alcanzó una altura de 30, mientras que el RBT alcanzó una altura de 14.</w:t>
+      </w:r>
+      <w:r>
+        <w:rPr>
+          <w:lang w:val="es-CO"/>
+        </w:rPr>
+        <w:t xml:space="preserve"> </w:t>
+      </w:r>
+      <w:r>
+        <w:rPr>
+          <w:lang w:val="es-CO"/>
+        </w:rPr>
+        <w:t>Para el índice de áreas se obtuvieron 879 llaves distintas. El BST alcanzó una altura de 20, mientras que el RBT alcanzó una altura de 13.</w:t>
+      </w:r>
+    </w:p>
+    <w:p>
+      <w:pPr>
+        <w:rPr>
+          <w:lang w:val="es-CO"/>
+        </w:rPr>
+      </w:pPr>
+      <w:r>
+        <w:rPr>
+          <w:lang w:val="es-CO"/>
+        </w:rPr>
+        <w:t>Por lo tanto, el RBT presentó una reducción importante en la altura:</w:t>
+      </w:r>
+    </w:p>
+    <w:p>
+      <w:pPr>
         <w:numPr>
           <w:ilvl w:val="0"/>
-          <w:numId w:val="17"/>
+          <w:numId w:val="20"/>
         </w:numPr>
-        <w:spacing w:after="106"/>
-        <w:ind w:hanging="278"/>
-        <w:rPr>
-          <w:lang w:val="es-CO"/>
-        </w:rPr>
-      </w:pPr>
-      <w:r>
-        <w:rPr>
-          <w:rFonts w:ascii="Arial" w:eastAsia="Arial" w:hAnsi="Arial" w:cs="Arial"/>
-          <w:b/>
-          <w:color w:val="2F4F9E"/>
-          <w:sz w:val="25"/>
-          <w:lang w:val="es-CO"/>
-        </w:rPr>
-        <w:t>¿Qué diferencia existe entre las alturas de los dos árboles (BST y RBT)?</w:t>
+        <w:rPr>
+          <w:lang w:val="es-CO"/>
+        </w:rPr>
+      </w:pPr>
+      <w:r>
+        <w:rPr>
+          <w:lang w:val="es-CO"/>
+        </w:rPr>
+        <w:t>Fechas: de 30 a 14 niveles.</w:t>
       </w:r>
     </w:p>
     <w:p>
       <w:pPr>
-        <w:spacing w:after="62"/>
-        <w:ind w:left="35"/>
-        <w:rPr>
-          <w:lang w:val="es-CO"/>
-        </w:rPr>
-      </w:pPr>
-      <w:r>
-        <w:rPr>
-          <w:lang w:val="es-CO"/>
-        </w:rPr>
-        <w:t xml:space="preserve">La altura del RBT es menor o igual a la del BST para los mismos datos, y está acotada. En un BST sin balanceo la altura depende del orden de inserción: si las llaves llegan casi ordenadas, el árbol se degenera en una lista y la altura puede llegar a ser del orden de N. En un RBT la regla de coloración (ningún nodo rojo con hijo rojo y la misma cantidad de enlaces negros en todos los caminos hacia las hojas) garantiza que la altura nunca supere 2·log (N+1). </w:t>
-      </w:r>
-      <w:r>
-        <w:rPr>
-          <w:sz w:val="17"/>
-          <w:lang w:val="es-CO"/>
-        </w:rPr>
-        <w:t>2</w:t>
+        <w:numPr>
+          <w:ilvl w:val="0"/>
+          <w:numId w:val="20"/>
+        </w:numPr>
+        <w:rPr>
+          <w:lang w:val="es-CO"/>
+        </w:rPr>
+      </w:pPr>
+      <w:r>
+        <w:rPr>
+          <w:lang w:val="es-CO"/>
+        </w:rPr>
+        <w:t>Áreas: de 20 a 13 niveles.</w:t>
       </w:r>
     </w:p>
     <w:p>
       <w:pPr>
-        <w:spacing w:after="3" w:line="223" w:lineRule="auto"/>
-        <w:ind w:left="35"/>
-        <w:rPr>
-          <w:lang w:val="es-CO"/>
-        </w:rPr>
-      </w:pPr>
-      <w:r>
-        <w:rPr>
-          <w:lang w:val="es-CO"/>
-        </w:rPr>
-        <w:t xml:space="preserve">En nuestra carga, el árbol por fechas tiene 1177 llaves y altura 13 en el RBT, mientras el mínimo teórico para esa cantidad es 11 (el techo de log (1178)) y la cota del RBT es cercana a 21. El árbol </w:t>
-      </w:r>
-      <w:r>
-        <w:rPr>
-          <w:sz w:val="17"/>
-          <w:lang w:val="es-CO"/>
-        </w:rPr>
-        <w:t>2</w:t>
+        <w:rPr>
+          <w:lang w:val="es-CO"/>
+        </w:rPr>
+      </w:pPr>
+      <w:r>
+        <w:rPr>
+          <w:lang w:val="es-CO"/>
+        </w:rPr>
+        <w:t>Esto demuestra que el RBT es más resistente al orden de inserción y ofrece una estructura más equilibrada que el BST.</w:t>
       </w:r>
     </w:p>
     <w:p>
       <w:pPr>
-        <w:spacing w:after="280" w:line="288" w:lineRule="auto"/>
-        <w:ind w:left="40"/>
-        <w:rPr>
-          <w:lang w:val="es-CO"/>
-        </w:rPr>
-      </w:pPr>
-      <w:r>
-        <w:rPr>
-          <w:lang w:val="es-CO"/>
-        </w:rPr>
-        <w:t>por áreas tiene 879 llaves y altura 12, también dentro de la cota. En el BST del laboratorio anterior la altura obtenida fue [ ], es decir, [mayor / similar] a la del RBT porque [explique según su resultado: el orden en que aparecen las fechas y las áreas en el archivo].</w:t>
+        <w:rPr>
+          <w:b/>
+          <w:bCs/>
+          <w:lang w:val="es-CO"/>
+        </w:rPr>
+      </w:pPr>
+      <w:r>
+        <w:rPr>
+          <w:b/>
+          <w:bCs/>
+          <w:lang w:val="es-CO"/>
+        </w:rPr>
+        <w:lastRenderedPageBreak/>
+        <w:t>b. ¿Percibe alguna diferencia entre la ejecución de los dos árboles (RBT y BST)? ¿Por qué pasa esto?</w:t>
       </w:r>
     </w:p>
     <w:p>
       <w:pPr>
+        <w:rPr>
+          <w:lang w:val="es-CO"/>
+        </w:rPr>
+      </w:pPr>
+      <w:r>
+        <w:rPr>
+          <w:lang w:val="es-CO"/>
+        </w:rPr>
+        <w:t>Sí se observa una diferencia entre los tiempos de ejecución. En la medición realizada, el BST tardó aproximadamente </w:t>
+      </w:r>
+      <w:r>
+        <w:rPr>
+          <w:b/>
+          <w:bCs/>
+          <w:lang w:val="es-CO"/>
+        </w:rPr>
+        <w:t>14455.53 ms</w:t>
+      </w:r>
+      <w:r>
+        <w:rPr>
+          <w:lang w:val="es-CO"/>
+        </w:rPr>
+        <w:t>, mientras que el RBT tardó aproximadamente </w:t>
+      </w:r>
+      <w:r>
+        <w:rPr>
+          <w:b/>
+          <w:bCs/>
+          <w:lang w:val="es-CO"/>
+        </w:rPr>
+        <w:t>14316.39 ms</w:t>
+      </w:r>
+      <w:r>
+        <w:rPr>
+          <w:lang w:val="es-CO"/>
+        </w:rPr>
+        <w:t>.</w:t>
+      </w:r>
+    </w:p>
+    <w:p>
+      <w:pPr>
+        <w:rPr>
+          <w:lang w:val="es-CO"/>
+        </w:rPr>
+      </w:pPr>
+      <w:r>
+        <w:rPr>
+          <w:lang w:val="es-CO"/>
+        </w:rPr>
+        <w:t>En esta ejecución, el RBT fue ligeramente más rápido que el BST, con una diferencia aproximada de 139 ms. Sin embargo, la diferencia no es muy grande porque ambos árboles manejan la misma cantidad de llaves distintas y la mayor parte del tiempo de carga corresponde también a la lectura del archivo, la creación de listas y la actualización de los índices auxiliares.</w:t>
+      </w:r>
+    </w:p>
+    <w:p>
+      <w:pPr>
+        <w:rPr>
+          <w:lang w:val="es-CO"/>
+        </w:rPr>
+      </w:pPr>
+      <w:r>
+        <w:rPr>
+          <w:lang w:val="es-CO"/>
+        </w:rPr>
+        <w:t>El RBT realiza trabajo adicional durante las inserciones, porque debe ejecutar rotaciones y cambios de color. Estas operaciones tienen costo constante en cada nivel recorrido. Sin embargo, este costo adicional se compensa porque el RBT conserva una altura mucho menor.</w:t>
+      </w:r>
+    </w:p>
+    <w:p>
+      <w:pPr>
+        <w:rPr>
+          <w:lang w:val="es-CO"/>
+        </w:rPr>
+      </w:pPr>
+      <w:r>
+        <w:rPr>
+          <w:lang w:val="es-CO"/>
+        </w:rPr>
+        <w:t>En este caso, el BST alcanzó alturas de 30 niveles para fechas y 20 para áreas, mientras que el RBT alcanzó alturas de 14 y 13, respectivamente. Por esta razón, las búsquedas y actualizaciones en el RBT recorren menos nodos.</w:t>
+      </w:r>
+    </w:p>
+    <w:p>
+      <w:pPr>
+        <w:rPr>
+          <w:lang w:val="es-CO"/>
+        </w:rPr>
+      </w:pPr>
+      <w:r>
+        <w:rPr>
+          <w:lang w:val="es-CO"/>
+        </w:rPr>
+        <w:t>La diferencia de tiempo no es tan grande como la diferencia de alturas debido a que:</w:t>
+      </w:r>
+    </w:p>
+    <w:p>
+      <w:pPr>
         <w:numPr>
           <w:ilvl w:val="0"/>
-          <w:numId w:val="17"/>
+          <w:numId w:val="21"/>
         </w:numPr>
-        <w:spacing w:after="106"/>
-        <w:ind w:hanging="278"/>
-      </w:pPr>
-      <w:r>
-        <w:rPr>
-          <w:rFonts w:ascii="Arial" w:eastAsia="Arial" w:hAnsi="Arial" w:cs="Arial"/>
-          <w:b/>
-          <w:color w:val="2F4F9E"/>
-          <w:sz w:val="25"/>
-          <w:lang w:val="es-CO"/>
-        </w:rPr>
-        <w:t xml:space="preserve">¿Percibe alguna diferencia entre la ejecución de los dos árboles (RBT yBST)? </w:t>
-      </w:r>
-      <w:r>
-        <w:rPr>
-          <w:rFonts w:ascii="Arial" w:eastAsia="Arial" w:hAnsi="Arial" w:cs="Arial"/>
-          <w:b/>
-          <w:color w:val="2F4F9E"/>
-          <w:sz w:val="25"/>
-        </w:rPr>
-        <w:t xml:space="preserve">¿Por </w:t>
-      </w:r>
-      <w:proofErr w:type="spellStart"/>
-      <w:r>
-        <w:rPr>
-          <w:rFonts w:ascii="Arial" w:eastAsia="Arial" w:hAnsi="Arial" w:cs="Arial"/>
-          <w:b/>
-          <w:color w:val="2F4F9E"/>
-          <w:sz w:val="25"/>
-        </w:rPr>
-        <w:t>qué</w:t>
-      </w:r>
-      <w:proofErr w:type="spellEnd"/>
-      <w:r>
-        <w:rPr>
-          <w:rFonts w:ascii="Arial" w:eastAsia="Arial" w:hAnsi="Arial" w:cs="Arial"/>
-          <w:b/>
-          <w:color w:val="2F4F9E"/>
-          <w:sz w:val="25"/>
-        </w:rPr>
-        <w:t xml:space="preserve"> </w:t>
-      </w:r>
-      <w:proofErr w:type="spellStart"/>
-      <w:r>
-        <w:rPr>
-          <w:rFonts w:ascii="Arial" w:eastAsia="Arial" w:hAnsi="Arial" w:cs="Arial"/>
-          <w:b/>
-          <w:color w:val="2F4F9E"/>
-          <w:sz w:val="25"/>
-        </w:rPr>
-        <w:t>pasa</w:t>
-      </w:r>
-      <w:proofErr w:type="spellEnd"/>
-      <w:r>
-        <w:rPr>
-          <w:rFonts w:ascii="Arial" w:eastAsia="Arial" w:hAnsi="Arial" w:cs="Arial"/>
-          <w:b/>
-          <w:color w:val="2F4F9E"/>
-          <w:sz w:val="25"/>
-        </w:rPr>
-        <w:t xml:space="preserve"> </w:t>
-      </w:r>
-      <w:proofErr w:type="spellStart"/>
-      <w:r>
-        <w:rPr>
-          <w:rFonts w:ascii="Arial" w:eastAsia="Arial" w:hAnsi="Arial" w:cs="Arial"/>
-          <w:b/>
-          <w:color w:val="2F4F9E"/>
-          <w:sz w:val="25"/>
-        </w:rPr>
-        <w:t>esto</w:t>
-      </w:r>
-      <w:proofErr w:type="spellEnd"/>
-      <w:r>
-        <w:rPr>
-          <w:rFonts w:ascii="Arial" w:eastAsia="Arial" w:hAnsi="Arial" w:cs="Arial"/>
-          <w:b/>
-          <w:color w:val="2F4F9E"/>
-          <w:sz w:val="25"/>
-        </w:rPr>
-        <w:t>?</w:t>
+        <w:rPr>
+          <w:lang w:val="es-CO"/>
+        </w:rPr>
+      </w:pPr>
+      <w:r>
+        <w:rPr>
+          <w:lang w:val="es-CO"/>
+        </w:rPr>
+        <w:t>Existen 319073 crímenes, pero solo 1177 fechas distintas y 879 áreas distintas.</w:t>
       </w:r>
     </w:p>
     <w:p>
       <w:pPr>
-        <w:ind w:left="35"/>
-      </w:pPr>
-      <w:r>
-        <w:rPr>
-          <w:lang w:val="es-CO"/>
-        </w:rPr>
-        <w:t xml:space="preserve">El tiempo de carga medido fue [ ] ms para el BST y [ ] ms para el RBT. </w:t>
-      </w:r>
-      <w:r>
-        <w:t xml:space="preserve">La </w:t>
-      </w:r>
-      <w:proofErr w:type="spellStart"/>
-      <w:r>
-        <w:t>diferencia</w:t>
-      </w:r>
-      <w:proofErr w:type="spellEnd"/>
-      <w:r>
-        <w:t xml:space="preserve"> </w:t>
-      </w:r>
-      <w:proofErr w:type="spellStart"/>
-      <w:r>
-        <w:t>depende</w:t>
-      </w:r>
-      <w:proofErr w:type="spellEnd"/>
-      <w:r>
-        <w:t xml:space="preserve"> de dos </w:t>
-      </w:r>
-      <w:proofErr w:type="spellStart"/>
-      <w:r>
-        <w:t>efectos</w:t>
-      </w:r>
-      <w:proofErr w:type="spellEnd"/>
-      <w:r>
-        <w:t xml:space="preserve"> </w:t>
-      </w:r>
-      <w:proofErr w:type="spellStart"/>
-      <w:r>
-        <w:t>opuestos</w:t>
-      </w:r>
-      <w:proofErr w:type="spellEnd"/>
-      <w:r>
-        <w:t>:</w:t>
+        <w:numPr>
+          <w:ilvl w:val="0"/>
+          <w:numId w:val="21"/>
+        </w:numPr>
+        <w:rPr>
+          <w:lang w:val="es-CO"/>
+        </w:rPr>
+      </w:pPr>
+      <w:r>
+        <w:rPr>
+          <w:lang w:val="es-CO"/>
+        </w:rPr>
+        <w:t>Muchas operaciones consisten en buscar una llave que ya existe y agregar el crimen a una lista.</w:t>
       </w:r>
     </w:p>
     <w:p>
       <w:pPr>
         <w:numPr>
           <w:ilvl w:val="0"/>
-          <w:numId w:val="18"/>
+          <w:numId w:val="21"/>
         </w:numPr>
-        <w:spacing w:after="145" w:line="296" w:lineRule="auto"/>
-        <w:ind w:hanging="320"/>
-        <w:jc w:val="both"/>
-        <w:rPr>
-          <w:lang w:val="es-CO"/>
-        </w:rPr>
-      </w:pPr>
-      <w:r>
-        <w:rPr>
-          <w:lang w:val="es-CO"/>
-        </w:rPr>
-        <w:t>El RBT hace trabajo extra en cada inserción de una llave nueva (rotaciones y cambios de color), lo que añade un costo constante por operación.</w:t>
+        <w:rPr>
+          <w:lang w:val="es-CO"/>
+        </w:rPr>
+      </w:pPr>
+      <w:r>
+        <w:rPr>
+          <w:lang w:val="es-CO"/>
+        </w:rPr>
+        <w:t>También se invierten recursos en procesar el archivo CSV y actualizar los mapas de ofensas.</w:t>
       </w:r>
     </w:p>
     <w:p>
       <w:pPr>
         <w:numPr>
           <w:ilvl w:val="0"/>
-          <w:numId w:val="18"/>
+          <w:numId w:val="21"/>
         </w:numPr>
-        <w:spacing w:after="145" w:line="296" w:lineRule="auto"/>
-        <w:ind w:hanging="320"/>
-        <w:jc w:val="both"/>
-        <w:rPr>
-          <w:lang w:val="es-CO"/>
-        </w:rPr>
-      </w:pPr>
-      <w:r>
-        <w:rPr>
-          <w:lang w:val="es-CO"/>
-        </w:rPr>
-        <w:t>Ese costo se compensa porque cada búsqueda y actualización recorre menos nodos al tener un árbol de altura menor. En esta carga hay solo 1177 llaves distintas por fechas frente a 319073 crímenes, así que la gran mayoría de las operaciones son búsquedas de llaves existentes y no inserciones nuevas.</w:t>
+        <w:rPr>
+          <w:lang w:val="es-CO"/>
+        </w:rPr>
+      </w:pPr>
+      <w:r>
+        <w:rPr>
+          <w:lang w:val="es-CO"/>
+        </w:rPr>
+        <w:t>El RBT debe realizar rotaciones y cambios de color durante algunas inserciones.</w:t>
       </w:r>
     </w:p>
     <w:p>
       <w:pPr>
-        <w:spacing w:after="274"/>
-        <w:ind w:left="35"/>
-        <w:rPr>
-          <w:lang w:val="es-CO"/>
-        </w:rPr>
-      </w:pPr>
-      <w:r>
-        <w:rPr>
-          <w:lang w:val="es-CO"/>
-        </w:rPr>
-        <w:lastRenderedPageBreak/>
-        <w:t>Por eso, cuando el BST queda desbalanceado el RBT resulta más rápido, y cuando el BST queda razonablemente balanceado los tiempos son parecidos, con una ligera ventaja del BST por no tener que rebalancear. Con base en nuestras mediciones: [concluya cuál fue más rápido y por qué].</w:t>
+        <w:rPr>
+          <w:lang w:val="es-CO"/>
+        </w:rPr>
+      </w:pPr>
+      <w:r>
+        <w:rPr>
+          <w:lang w:val="es-CO"/>
+        </w:rPr>
+        <w:t>En general, cuando el BST queda muy desbalanceado, el RBT puede ser más rápido y estable. Si el BST recibe datos en un orden favorable, ambos árboles pueden tener tiempos parecidos, aunque el RBT mantiene mejores garantías de rendimiento.</w:t>
       </w:r>
     </w:p>
     <w:p>
       <w:pPr>
-        <w:spacing w:after="50"/>
-        <w:ind w:left="35"/>
-        <w:rPr>
-          <w:lang w:val="es-CO"/>
-        </w:rPr>
-      </w:pPr>
-      <w:r>
-        <w:rPr>
-          <w:rFonts w:ascii="Arial" w:eastAsia="Arial" w:hAnsi="Arial" w:cs="Arial"/>
+        <w:rPr>
           <w:b/>
-          <w:color w:val="2F4F9E"/>
-          <w:sz w:val="25"/>
+          <w:bCs/>
+          <w:lang w:val="es-CO"/>
+        </w:rPr>
+      </w:pPr>
+      <w:r>
+        <w:rPr>
+          <w:b/>
+          <w:bCs/>
           <w:lang w:val="es-CO"/>
         </w:rPr>
         <w:t>c. ¿Existe alguna diferencia de complejidad entre los dos árboles (RBT y BST)?</w:t>
@@ -861,78 +1081,137 @@
     </w:p>
     <w:p>
       <w:pPr>
-        <w:spacing w:after="106"/>
-        <w:ind w:left="35"/>
-        <w:rPr>
-          <w:lang w:val="es-CO"/>
-        </w:rPr>
-      </w:pPr>
-      <w:r>
-        <w:rPr>
-          <w:rFonts w:ascii="Arial" w:eastAsia="Arial" w:hAnsi="Arial" w:cs="Arial"/>
-          <w:b/>
-          <w:color w:val="2F4F9E"/>
-          <w:sz w:val="25"/>
-          <w:lang w:val="es-CO"/>
-        </w:rPr>
-        <w:t>Justifique su respuesta.</w:t>
+        <w:rPr>
+          <w:lang w:val="es-CO"/>
+        </w:rPr>
+      </w:pPr>
+      <w:r>
+        <w:rPr>
+          <w:lang w:val="es-CO"/>
+        </w:rPr>
+        <w:t>Sí existe una diferencia importante en el peor caso.</w:t>
       </w:r>
     </w:p>
     <w:p>
       <w:pPr>
-        <w:spacing w:after="0"/>
-        <w:ind w:left="35"/>
-        <w:rPr>
-          <w:lang w:val="es-CO"/>
-        </w:rPr>
-      </w:pPr>
-      <w:r>
-        <w:rPr>
-          <w:lang w:val="es-CO"/>
-        </w:rPr>
-        <w:t>Sí, en el peor caso. El costo de put, get, contains, get_min, get_max y de las consultas por rango es proporcional a la altura del árbol.</w:t>
+        <w:rPr>
+          <w:lang w:val="es-CO"/>
+        </w:rPr>
+      </w:pPr>
+      <w:r>
+        <w:rPr>
+          <w:lang w:val="es-CO"/>
+        </w:rPr>
+        <w:t xml:space="preserve">El costo de las operaciones principales depende de la altura del árbol. En un BST desbalanceado, la altura puede ser O(N). En un BST razonablemente balanceado, la altura promedio puede ser </w:t>
+      </w:r>
+      <w:proofErr w:type="gramStart"/>
+      <w:r>
+        <w:rPr>
+          <w:lang w:val="es-CO"/>
+        </w:rPr>
+        <w:t>O(</w:t>
+      </w:r>
+      <w:proofErr w:type="gramEnd"/>
+      <w:r>
+        <w:rPr>
+          <w:lang w:val="es-CO"/>
+        </w:rPr>
+        <w:t>log n)</w:t>
+      </w:r>
+      <w:r>
+        <w:rPr>
+          <w:lang w:val="es-CO"/>
+        </w:rPr>
+        <w:t>.</w:t>
+      </w:r>
+    </w:p>
+    <w:p>
+      <w:pPr>
+        <w:rPr>
+          <w:lang w:val="es-CO"/>
+        </w:rPr>
+      </w:pPr>
+      <w:r>
+        <w:rPr>
+          <w:lang w:val="es-CO"/>
+        </w:rPr>
+        <w:t xml:space="preserve">El RBT garantiza que la altura se mantenga en </w:t>
+      </w:r>
+      <w:proofErr w:type="gramStart"/>
+      <w:r>
+        <w:rPr>
+          <w:lang w:val="es-CO"/>
+        </w:rPr>
+        <w:t>O(</w:t>
+      </w:r>
+      <w:proofErr w:type="gramEnd"/>
+      <w:r>
+        <w:rPr>
+          <w:lang w:val="es-CO"/>
+        </w:rPr>
+        <w:t>log n)</w:t>
+      </w:r>
+      <w:r>
+        <w:rPr>
+          <w:lang w:val="es-CO"/>
+        </w:rPr>
+        <w:t>, independientemente del orden de inserción.</w:t>
       </w:r>
     </w:p>
     <w:tbl>
       <w:tblPr>
-        <w:tblStyle w:val="TableGrid"/>
-        <w:tblW w:w="9648" w:type="dxa"/>
-        <w:tblInd w:w="-80" w:type="dxa"/>
+        <w:tblW w:w="0" w:type="auto"/>
+        <w:tblBorders>
+          <w:top w:val="single" w:sz="4" w:space="0" w:color="auto"/>
+          <w:left w:val="single" w:sz="4" w:space="0" w:color="auto"/>
+          <w:bottom w:val="single" w:sz="4" w:space="0" w:color="auto"/>
+          <w:right w:val="single" w:sz="4" w:space="0" w:color="auto"/>
+          <w:insideH w:val="single" w:sz="4" w:space="0" w:color="auto"/>
+          <w:insideV w:val="single" w:sz="4" w:space="0" w:color="auto"/>
+        </w:tblBorders>
         <w:tblCellMar>
-          <w:top w:w="134" w:type="dxa"/>
-          <w:left w:w="120" w:type="dxa"/>
-          <w:right w:w="115" w:type="dxa"/>
+          <w:top w:w="15" w:type="dxa"/>
+          <w:left w:w="15" w:type="dxa"/>
+          <w:bottom w:w="15" w:type="dxa"/>
+          <w:right w:w="15" w:type="dxa"/>
         </w:tblCellMar>
         <w:tblLook w:val="04A0" w:firstRow="1" w:lastRow="0" w:firstColumn="1" w:lastColumn="0" w:noHBand="0" w:noVBand="1"/>
       </w:tblPr>
       <w:tblGrid>
-        <w:gridCol w:w="2880"/>
-        <w:gridCol w:w="2160"/>
-        <w:gridCol w:w="2448"/>
-        <w:gridCol w:w="2160"/>
+        <w:gridCol w:w="2371"/>
+        <w:gridCol w:w="1568"/>
+        <w:gridCol w:w="2038"/>
+        <w:gridCol w:w="1588"/>
       </w:tblGrid>
       <w:tr>
         <w:trPr>
-          <w:trHeight w:val="400"/>
+          <w:tblHeader/>
         </w:trPr>
         <w:tc>
           <w:tcPr>
-            <w:tcW w:w="2880" w:type="dxa"/>
-            <w:tcBorders>
-              <w:top w:val="single" w:sz="4" w:space="0" w:color="999999"/>
-              <w:left w:val="single" w:sz="4" w:space="0" w:color="999999"/>
-              <w:bottom w:val="single" w:sz="4" w:space="0" w:color="999999"/>
-              <w:right w:val="single" w:sz="4" w:space="0" w:color="999999"/>
-            </w:tcBorders>
-            <w:shd w:val="clear" w:color="auto" w:fill="2F4F9E"/>
+            <w:tcW w:w="0" w:type="auto"/>
+            <w:tcMar>
+              <w:top w:w="75" w:type="dxa"/>
+              <w:left w:w="150" w:type="dxa"/>
+              <w:bottom w:w="75" w:type="dxa"/>
+              <w:right w:w="150" w:type="dxa"/>
+            </w:tcMar>
+            <w:vAlign w:val="center"/>
+            <w:hideMark/>
           </w:tcPr>
           <w:p>
+            <w:pPr>
+              <w:rPr>
+                <w:b/>
+                <w:bCs/>
+                <w:lang w:val="es-CO"/>
+              </w:rPr>
+            </w:pPr>
             <w:r>
               <w:rPr>
-                <w:rFonts w:ascii="Arial" w:eastAsia="Arial" w:hAnsi="Arial" w:cs="Arial"/>
                 <w:b/>
-                <w:color w:val="FFFFFF"/>
-                <w:sz w:val="19"/>
+                <w:bCs/>
+                <w:lang w:val="es-CO"/>
               </w:rPr>
               <w:t>Operación</w:t>
             </w:r>
@@ -940,410 +1219,683 @@
         </w:tc>
         <w:tc>
           <w:tcPr>
-            <w:tcW w:w="2160" w:type="dxa"/>
-            <w:tcBorders>
-              <w:top w:val="single" w:sz="4" w:space="0" w:color="999999"/>
-              <w:left w:val="single" w:sz="4" w:space="0" w:color="999999"/>
-              <w:bottom w:val="single" w:sz="4" w:space="0" w:color="999999"/>
-              <w:right w:val="single" w:sz="4" w:space="0" w:color="999999"/>
-            </w:tcBorders>
-            <w:shd w:val="clear" w:color="auto" w:fill="2F4F9E"/>
+            <w:tcW w:w="0" w:type="auto"/>
+            <w:tcMar>
+              <w:top w:w="75" w:type="dxa"/>
+              <w:left w:w="150" w:type="dxa"/>
+              <w:bottom w:w="75" w:type="dxa"/>
+              <w:right w:w="150" w:type="dxa"/>
+            </w:tcMar>
+            <w:vAlign w:val="center"/>
+            <w:hideMark/>
           </w:tcPr>
           <w:p>
+            <w:pPr>
+              <w:rPr>
+                <w:b/>
+                <w:bCs/>
+                <w:lang w:val="es-CO"/>
+              </w:rPr>
+            </w:pPr>
             <w:r>
               <w:rPr>
-                <w:rFonts w:ascii="Arial" w:eastAsia="Arial" w:hAnsi="Arial" w:cs="Arial"/>
                 <w:b/>
-                <w:color w:val="FFFFFF"/>
-                <w:sz w:val="19"/>
-              </w:rPr>
-              <w:t>BST (peor caso)</w:t>
+                <w:bCs/>
+                <w:lang w:val="es-CO"/>
+              </w:rPr>
+              <w:t>BST peor caso</w:t>
             </w:r>
           </w:p>
         </w:tc>
         <w:tc>
           <w:tcPr>
-            <w:tcW w:w="2448" w:type="dxa"/>
-            <w:tcBorders>
-              <w:top w:val="single" w:sz="4" w:space="0" w:color="999999"/>
-              <w:left w:val="single" w:sz="4" w:space="0" w:color="999999"/>
-              <w:bottom w:val="single" w:sz="4" w:space="0" w:color="999999"/>
-              <w:right w:val="single" w:sz="4" w:space="0" w:color="999999"/>
-            </w:tcBorders>
-            <w:shd w:val="clear" w:color="auto" w:fill="2F4F9E"/>
+            <w:tcW w:w="0" w:type="auto"/>
+            <w:tcMar>
+              <w:top w:w="75" w:type="dxa"/>
+              <w:left w:w="150" w:type="dxa"/>
+              <w:bottom w:w="75" w:type="dxa"/>
+              <w:right w:w="150" w:type="dxa"/>
+            </w:tcMar>
+            <w:vAlign w:val="center"/>
+            <w:hideMark/>
           </w:tcPr>
           <w:p>
+            <w:pPr>
+              <w:rPr>
+                <w:b/>
+                <w:bCs/>
+                <w:lang w:val="es-CO"/>
+              </w:rPr>
+            </w:pPr>
             <w:r>
               <w:rPr>
-                <w:rFonts w:ascii="Arial" w:eastAsia="Arial" w:hAnsi="Arial" w:cs="Arial"/>
                 <w:b/>
-                <w:color w:val="FFFFFF"/>
-                <w:sz w:val="19"/>
-              </w:rPr>
-              <w:t>BST (caso promedio)</w:t>
+                <w:bCs/>
+                <w:lang w:val="es-CO"/>
+              </w:rPr>
+              <w:t>BST caso promedio</w:t>
             </w:r>
           </w:p>
         </w:tc>
         <w:tc>
           <w:tcPr>
-            <w:tcW w:w="2160" w:type="dxa"/>
-            <w:tcBorders>
-              <w:top w:val="single" w:sz="4" w:space="0" w:color="999999"/>
-              <w:left w:val="single" w:sz="4" w:space="0" w:color="999999"/>
-              <w:bottom w:val="single" w:sz="4" w:space="0" w:color="999999"/>
-              <w:right w:val="single" w:sz="4" w:space="0" w:color="999999"/>
-            </w:tcBorders>
-            <w:shd w:val="clear" w:color="auto" w:fill="2F4F9E"/>
+            <w:tcW w:w="0" w:type="auto"/>
+            <w:tcMar>
+              <w:top w:w="75" w:type="dxa"/>
+              <w:left w:w="150" w:type="dxa"/>
+              <w:bottom w:w="75" w:type="dxa"/>
+              <w:right w:w="150" w:type="dxa"/>
+            </w:tcMar>
+            <w:vAlign w:val="center"/>
+            <w:hideMark/>
           </w:tcPr>
           <w:p>
+            <w:pPr>
+              <w:rPr>
+                <w:b/>
+                <w:bCs/>
+                <w:lang w:val="es-CO"/>
+              </w:rPr>
+            </w:pPr>
             <w:r>
               <w:rPr>
-                <w:rFonts w:ascii="Arial" w:eastAsia="Arial" w:hAnsi="Arial" w:cs="Arial"/>
                 <w:b/>
-                <w:color w:val="FFFFFF"/>
-                <w:sz w:val="19"/>
-              </w:rPr>
-              <w:t>RBT (peor caso)</w:t>
+                <w:bCs/>
+                <w:lang w:val="es-CO"/>
+              </w:rPr>
+              <w:t>RBT peor caso</w:t>
             </w:r>
           </w:p>
         </w:tc>
       </w:tr>
       <w:tr>
-        <w:trPr>
-          <w:trHeight w:val="400"/>
-        </w:trPr>
         <w:tc>
           <w:tcPr>
-            <w:tcW w:w="2880" w:type="dxa"/>
-            <w:tcBorders>
-              <w:top w:val="single" w:sz="4" w:space="0" w:color="999999"/>
-              <w:left w:val="single" w:sz="4" w:space="0" w:color="999999"/>
-              <w:bottom w:val="single" w:sz="4" w:space="0" w:color="999999"/>
-              <w:right w:val="single" w:sz="4" w:space="0" w:color="999999"/>
-            </w:tcBorders>
-            <w:shd w:val="clear" w:color="auto" w:fill="FFFFFF"/>
+            <w:tcW w:w="0" w:type="auto"/>
+            <w:tcMar>
+              <w:top w:w="75" w:type="dxa"/>
+              <w:left w:w="150" w:type="dxa"/>
+              <w:bottom w:w="75" w:type="dxa"/>
+              <w:right w:w="150" w:type="dxa"/>
+            </w:tcMar>
+            <w:vAlign w:val="center"/>
+            <w:hideMark/>
           </w:tcPr>
           <w:p>
+            <w:pPr>
+              <w:rPr>
+                <w:lang w:val="es-CO"/>
+              </w:rPr>
+            </w:pPr>
+            <w:proofErr w:type="spellStart"/>
             <w:r>
               <w:rPr>
-                <w:sz w:val="19"/>
+                <w:lang w:val="es-CO"/>
               </w:rPr>
               <w:t>put</w:t>
+            </w:r>
+            <w:proofErr w:type="spellEnd"/>
+          </w:p>
+        </w:tc>
+        <w:tc>
+          <w:tcPr>
+            <w:tcW w:w="0" w:type="auto"/>
+            <w:tcMar>
+              <w:top w:w="75" w:type="dxa"/>
+              <w:left w:w="150" w:type="dxa"/>
+              <w:bottom w:w="75" w:type="dxa"/>
+              <w:right w:w="150" w:type="dxa"/>
+            </w:tcMar>
+            <w:vAlign w:val="center"/>
+            <w:hideMark/>
+          </w:tcPr>
+          <w:p>
+            <w:pPr>
+              <w:rPr>
+                <w:lang w:val="es-CO"/>
+              </w:rPr>
+            </w:pPr>
+            <w:r>
+              <w:rPr>
+                <w:lang w:val="es-CO"/>
+              </w:rPr>
+              <w:t>(O(N))</w:t>
             </w:r>
           </w:p>
         </w:tc>
         <w:tc>
           <w:tcPr>
-            <w:tcW w:w="2160" w:type="dxa"/>
-            <w:tcBorders>
-              <w:top w:val="single" w:sz="4" w:space="0" w:color="999999"/>
-              <w:left w:val="single" w:sz="4" w:space="0" w:color="999999"/>
-              <w:bottom w:val="single" w:sz="4" w:space="0" w:color="999999"/>
-              <w:right w:val="single" w:sz="4" w:space="0" w:color="999999"/>
-            </w:tcBorders>
-            <w:shd w:val="clear" w:color="auto" w:fill="FFFFFF"/>
+            <w:tcW w:w="0" w:type="auto"/>
+            <w:tcMar>
+              <w:top w:w="75" w:type="dxa"/>
+              <w:left w:w="150" w:type="dxa"/>
+              <w:bottom w:w="75" w:type="dxa"/>
+              <w:right w:w="150" w:type="dxa"/>
+            </w:tcMar>
+            <w:vAlign w:val="center"/>
+            <w:hideMark/>
           </w:tcPr>
           <w:p>
+            <w:pPr>
+              <w:rPr>
+                <w:lang w:val="es-CO"/>
+              </w:rPr>
+            </w:pPr>
             <w:r>
               <w:rPr>
-                <w:sz w:val="19"/>
-              </w:rPr>
-              <w:t>O(N)</w:t>
+                <w:lang w:val="es-CO"/>
+              </w:rPr>
+              <w:t>(</w:t>
+            </w:r>
+            <w:proofErr w:type="gramStart"/>
+            <w:r>
+              <w:rPr>
+                <w:lang w:val="es-CO"/>
+              </w:rPr>
+              <w:t>O(</w:t>
+            </w:r>
+            <w:proofErr w:type="gramEnd"/>
+            <w:r>
+              <w:rPr>
+                <w:lang w:val="es-CO"/>
+              </w:rPr>
+              <w:t>log N))</w:t>
             </w:r>
           </w:p>
         </w:tc>
         <w:tc>
           <w:tcPr>
-            <w:tcW w:w="2448" w:type="dxa"/>
-            <w:tcBorders>
-              <w:top w:val="single" w:sz="4" w:space="0" w:color="999999"/>
-              <w:left w:val="single" w:sz="4" w:space="0" w:color="999999"/>
-              <w:bottom w:val="single" w:sz="4" w:space="0" w:color="999999"/>
-              <w:right w:val="single" w:sz="4" w:space="0" w:color="999999"/>
-            </w:tcBorders>
-            <w:shd w:val="clear" w:color="auto" w:fill="FFFFFF"/>
+            <w:tcW w:w="0" w:type="auto"/>
+            <w:tcMar>
+              <w:top w:w="75" w:type="dxa"/>
+              <w:left w:w="150" w:type="dxa"/>
+              <w:bottom w:w="75" w:type="dxa"/>
+              <w:right w:w="150" w:type="dxa"/>
+            </w:tcMar>
+            <w:vAlign w:val="center"/>
+            <w:hideMark/>
           </w:tcPr>
           <w:p>
+            <w:pPr>
+              <w:rPr>
+                <w:lang w:val="es-CO"/>
+              </w:rPr>
+            </w:pPr>
             <w:r>
               <w:rPr>
-                <w:sz w:val="19"/>
-              </w:rPr>
-              <w:t>O(log N)</w:t>
+                <w:lang w:val="es-CO"/>
+              </w:rPr>
+              <w:t>(</w:t>
+            </w:r>
+            <w:proofErr w:type="gramStart"/>
+            <w:r>
+              <w:rPr>
+                <w:lang w:val="es-CO"/>
+              </w:rPr>
+              <w:t>O(</w:t>
+            </w:r>
+            <w:proofErr w:type="gramEnd"/>
+            <w:r>
+              <w:rPr>
+                <w:lang w:val="es-CO"/>
+              </w:rPr>
+              <w:t>log N))</w:t>
+            </w:r>
+          </w:p>
+        </w:tc>
+      </w:tr>
+      <w:tr>
+        <w:tc>
+          <w:tcPr>
+            <w:tcW w:w="0" w:type="auto"/>
+            <w:tcMar>
+              <w:top w:w="75" w:type="dxa"/>
+              <w:left w:w="150" w:type="dxa"/>
+              <w:bottom w:w="75" w:type="dxa"/>
+              <w:right w:w="150" w:type="dxa"/>
+            </w:tcMar>
+            <w:vAlign w:val="center"/>
+            <w:hideMark/>
+          </w:tcPr>
+          <w:p>
+            <w:pPr>
+              <w:rPr>
+                <w:lang w:val="es-CO"/>
+              </w:rPr>
+            </w:pPr>
+            <w:proofErr w:type="spellStart"/>
+            <w:r>
+              <w:rPr>
+                <w:lang w:val="es-CO"/>
+              </w:rPr>
+              <w:t>get</w:t>
+            </w:r>
+            <w:proofErr w:type="spellEnd"/>
+            <w:r>
+              <w:rPr>
+                <w:lang w:val="es-CO"/>
+              </w:rPr>
+              <w:t> / </w:t>
+            </w:r>
+            <w:proofErr w:type="spellStart"/>
+            <w:r>
+              <w:rPr>
+                <w:lang w:val="es-CO"/>
+              </w:rPr>
+              <w:t>contains</w:t>
+            </w:r>
+            <w:proofErr w:type="spellEnd"/>
+          </w:p>
+        </w:tc>
+        <w:tc>
+          <w:tcPr>
+            <w:tcW w:w="0" w:type="auto"/>
+            <w:tcMar>
+              <w:top w:w="75" w:type="dxa"/>
+              <w:left w:w="150" w:type="dxa"/>
+              <w:bottom w:w="75" w:type="dxa"/>
+              <w:right w:w="150" w:type="dxa"/>
+            </w:tcMar>
+            <w:vAlign w:val="center"/>
+            <w:hideMark/>
+          </w:tcPr>
+          <w:p>
+            <w:pPr>
+              <w:rPr>
+                <w:lang w:val="es-CO"/>
+              </w:rPr>
+            </w:pPr>
+            <w:r>
+              <w:rPr>
+                <w:lang w:val="es-CO"/>
+              </w:rPr>
+              <w:t>(O(N))</w:t>
             </w:r>
           </w:p>
         </w:tc>
         <w:tc>
           <w:tcPr>
-            <w:tcW w:w="2160" w:type="dxa"/>
-            <w:tcBorders>
-              <w:top w:val="single" w:sz="4" w:space="0" w:color="999999"/>
-              <w:left w:val="single" w:sz="4" w:space="0" w:color="999999"/>
-              <w:bottom w:val="single" w:sz="4" w:space="0" w:color="999999"/>
-              <w:right w:val="single" w:sz="4" w:space="0" w:color="999999"/>
-            </w:tcBorders>
-            <w:shd w:val="clear" w:color="auto" w:fill="FFFFFF"/>
+            <w:tcW w:w="0" w:type="auto"/>
+            <w:tcMar>
+              <w:top w:w="75" w:type="dxa"/>
+              <w:left w:w="150" w:type="dxa"/>
+              <w:bottom w:w="75" w:type="dxa"/>
+              <w:right w:w="150" w:type="dxa"/>
+            </w:tcMar>
+            <w:vAlign w:val="center"/>
+            <w:hideMark/>
           </w:tcPr>
           <w:p>
+            <w:pPr>
+              <w:rPr>
+                <w:lang w:val="es-CO"/>
+              </w:rPr>
+            </w:pPr>
             <w:r>
               <w:rPr>
-                <w:sz w:val="19"/>
-              </w:rPr>
-              <w:t>O(log N)</w:t>
+                <w:lang w:val="es-CO"/>
+              </w:rPr>
+              <w:t>(</w:t>
+            </w:r>
+            <w:proofErr w:type="gramStart"/>
+            <w:r>
+              <w:rPr>
+                <w:lang w:val="es-CO"/>
+              </w:rPr>
+              <w:t>O(</w:t>
+            </w:r>
+            <w:proofErr w:type="gramEnd"/>
+            <w:r>
+              <w:rPr>
+                <w:lang w:val="es-CO"/>
+              </w:rPr>
+              <w:t>log N))</w:t>
+            </w:r>
+          </w:p>
+        </w:tc>
+        <w:tc>
+          <w:tcPr>
+            <w:tcW w:w="0" w:type="auto"/>
+            <w:tcMar>
+              <w:top w:w="75" w:type="dxa"/>
+              <w:left w:w="150" w:type="dxa"/>
+              <w:bottom w:w="75" w:type="dxa"/>
+              <w:right w:w="150" w:type="dxa"/>
+            </w:tcMar>
+            <w:vAlign w:val="center"/>
+            <w:hideMark/>
+          </w:tcPr>
+          <w:p>
+            <w:pPr>
+              <w:rPr>
+                <w:lang w:val="es-CO"/>
+              </w:rPr>
+            </w:pPr>
+            <w:r>
+              <w:rPr>
+                <w:lang w:val="es-CO"/>
+              </w:rPr>
+              <w:t>(</w:t>
+            </w:r>
+            <w:proofErr w:type="gramStart"/>
+            <w:r>
+              <w:rPr>
+                <w:lang w:val="es-CO"/>
+              </w:rPr>
+              <w:t>O(</w:t>
+            </w:r>
+            <w:proofErr w:type="gramEnd"/>
+            <w:r>
+              <w:rPr>
+                <w:lang w:val="es-CO"/>
+              </w:rPr>
+              <w:t>log N))</w:t>
             </w:r>
           </w:p>
         </w:tc>
       </w:tr>
       <w:tr>
-        <w:trPr>
-          <w:trHeight w:val="400"/>
-        </w:trPr>
         <w:tc>
           <w:tcPr>
-            <w:tcW w:w="2880" w:type="dxa"/>
-            <w:tcBorders>
-              <w:top w:val="single" w:sz="4" w:space="0" w:color="999999"/>
-              <w:left w:val="single" w:sz="4" w:space="0" w:color="999999"/>
-              <w:bottom w:val="single" w:sz="4" w:space="0" w:color="999999"/>
-              <w:right w:val="single" w:sz="4" w:space="0" w:color="999999"/>
-            </w:tcBorders>
-            <w:shd w:val="clear" w:color="auto" w:fill="EEF2FA"/>
+            <w:tcW w:w="0" w:type="auto"/>
+            <w:tcMar>
+              <w:top w:w="75" w:type="dxa"/>
+              <w:left w:w="150" w:type="dxa"/>
+              <w:bottom w:w="75" w:type="dxa"/>
+              <w:right w:w="150" w:type="dxa"/>
+            </w:tcMar>
+            <w:vAlign w:val="center"/>
+            <w:hideMark/>
           </w:tcPr>
           <w:p>
+            <w:pPr>
+              <w:rPr>
+                <w:lang w:val="es-CO"/>
+              </w:rPr>
+            </w:pPr>
+            <w:proofErr w:type="spellStart"/>
             <w:r>
               <w:rPr>
-                <w:sz w:val="19"/>
-              </w:rPr>
-              <w:t>get / contains</w:t>
+                <w:lang w:val="es-CO"/>
+              </w:rPr>
+              <w:t>get_min</w:t>
+            </w:r>
+            <w:proofErr w:type="spellEnd"/>
+            <w:r>
+              <w:rPr>
+                <w:lang w:val="es-CO"/>
+              </w:rPr>
+              <w:t> / </w:t>
+            </w:r>
+            <w:proofErr w:type="spellStart"/>
+            <w:r>
+              <w:rPr>
+                <w:lang w:val="es-CO"/>
+              </w:rPr>
+              <w:t>get_max</w:t>
+            </w:r>
+            <w:proofErr w:type="spellEnd"/>
+          </w:p>
+        </w:tc>
+        <w:tc>
+          <w:tcPr>
+            <w:tcW w:w="0" w:type="auto"/>
+            <w:tcMar>
+              <w:top w:w="75" w:type="dxa"/>
+              <w:left w:w="150" w:type="dxa"/>
+              <w:bottom w:w="75" w:type="dxa"/>
+              <w:right w:w="150" w:type="dxa"/>
+            </w:tcMar>
+            <w:vAlign w:val="center"/>
+            <w:hideMark/>
+          </w:tcPr>
+          <w:p>
+            <w:pPr>
+              <w:rPr>
+                <w:lang w:val="es-CO"/>
+              </w:rPr>
+            </w:pPr>
+            <w:r>
+              <w:rPr>
+                <w:lang w:val="es-CO"/>
+              </w:rPr>
+              <w:t>(O(N))</w:t>
             </w:r>
           </w:p>
         </w:tc>
         <w:tc>
           <w:tcPr>
-            <w:tcW w:w="2160" w:type="dxa"/>
-            <w:tcBorders>
-              <w:top w:val="single" w:sz="4" w:space="0" w:color="999999"/>
-              <w:left w:val="single" w:sz="4" w:space="0" w:color="999999"/>
-              <w:bottom w:val="single" w:sz="4" w:space="0" w:color="999999"/>
-              <w:right w:val="single" w:sz="4" w:space="0" w:color="999999"/>
-            </w:tcBorders>
-            <w:shd w:val="clear" w:color="auto" w:fill="EEF2FA"/>
+            <w:tcW w:w="0" w:type="auto"/>
+            <w:tcMar>
+              <w:top w:w="75" w:type="dxa"/>
+              <w:left w:w="150" w:type="dxa"/>
+              <w:bottom w:w="75" w:type="dxa"/>
+              <w:right w:w="150" w:type="dxa"/>
+            </w:tcMar>
+            <w:vAlign w:val="center"/>
+            <w:hideMark/>
           </w:tcPr>
           <w:p>
+            <w:pPr>
+              <w:rPr>
+                <w:lang w:val="es-CO"/>
+              </w:rPr>
+            </w:pPr>
             <w:r>
               <w:rPr>
-                <w:sz w:val="19"/>
-              </w:rPr>
-              <w:t>O(N)</w:t>
+                <w:lang w:val="es-CO"/>
+              </w:rPr>
+              <w:t>(</w:t>
+            </w:r>
+            <w:proofErr w:type="gramStart"/>
+            <w:r>
+              <w:rPr>
+                <w:lang w:val="es-CO"/>
+              </w:rPr>
+              <w:t>O(</w:t>
+            </w:r>
+            <w:proofErr w:type="gramEnd"/>
+            <w:r>
+              <w:rPr>
+                <w:lang w:val="es-CO"/>
+              </w:rPr>
+              <w:t>log N))</w:t>
             </w:r>
           </w:p>
         </w:tc>
         <w:tc>
           <w:tcPr>
-            <w:tcW w:w="2448" w:type="dxa"/>
-            <w:tcBorders>
-              <w:top w:val="single" w:sz="4" w:space="0" w:color="999999"/>
-              <w:left w:val="single" w:sz="4" w:space="0" w:color="999999"/>
-              <w:bottom w:val="single" w:sz="4" w:space="0" w:color="999999"/>
-              <w:right w:val="single" w:sz="4" w:space="0" w:color="999999"/>
-            </w:tcBorders>
-            <w:shd w:val="clear" w:color="auto" w:fill="EEF2FA"/>
+            <w:tcW w:w="0" w:type="auto"/>
+            <w:tcMar>
+              <w:top w:w="75" w:type="dxa"/>
+              <w:left w:w="150" w:type="dxa"/>
+              <w:bottom w:w="75" w:type="dxa"/>
+              <w:right w:w="150" w:type="dxa"/>
+            </w:tcMar>
+            <w:vAlign w:val="center"/>
+            <w:hideMark/>
           </w:tcPr>
           <w:p>
+            <w:pPr>
+              <w:rPr>
+                <w:lang w:val="es-CO"/>
+              </w:rPr>
+            </w:pPr>
             <w:r>
               <w:rPr>
-                <w:sz w:val="19"/>
-              </w:rPr>
-              <w:t>O(log N)</w:t>
+                <w:lang w:val="es-CO"/>
+              </w:rPr>
+              <w:t>(</w:t>
+            </w:r>
+            <w:proofErr w:type="gramStart"/>
+            <w:r>
+              <w:rPr>
+                <w:lang w:val="es-CO"/>
+              </w:rPr>
+              <w:t>O(</w:t>
+            </w:r>
+            <w:proofErr w:type="gramEnd"/>
+            <w:r>
+              <w:rPr>
+                <w:lang w:val="es-CO"/>
+              </w:rPr>
+              <w:t>log N))</w:t>
+            </w:r>
+          </w:p>
+        </w:tc>
+      </w:tr>
+      <w:tr>
+        <w:tc>
+          <w:tcPr>
+            <w:tcW w:w="0" w:type="auto"/>
+            <w:tcMar>
+              <w:top w:w="75" w:type="dxa"/>
+              <w:left w:w="150" w:type="dxa"/>
+              <w:bottom w:w="75" w:type="dxa"/>
+              <w:right w:w="150" w:type="dxa"/>
+            </w:tcMar>
+            <w:vAlign w:val="center"/>
+            <w:hideMark/>
+          </w:tcPr>
+          <w:p>
+            <w:pPr>
+              <w:rPr>
+                <w:lang w:val="es-CO"/>
+              </w:rPr>
+            </w:pPr>
+            <w:proofErr w:type="spellStart"/>
+            <w:r>
+              <w:rPr>
+                <w:lang w:val="es-CO"/>
+              </w:rPr>
+              <w:t>keys</w:t>
+            </w:r>
+            <w:proofErr w:type="spellEnd"/>
+            <w:r>
+              <w:rPr>
+                <w:lang w:val="es-CO"/>
+              </w:rPr>
+              <w:t> / </w:t>
+            </w:r>
+            <w:proofErr w:type="spellStart"/>
+            <w:r>
+              <w:rPr>
+                <w:lang w:val="es-CO"/>
+              </w:rPr>
+              <w:t>values</w:t>
+            </w:r>
+            <w:proofErr w:type="spellEnd"/>
+            <w:r>
+              <w:rPr>
+                <w:lang w:val="es-CO"/>
+              </w:rPr>
+              <w:t> por rango</w:t>
             </w:r>
           </w:p>
         </w:tc>
         <w:tc>
           <w:tcPr>
-            <w:tcW w:w="2160" w:type="dxa"/>
-            <w:tcBorders>
-              <w:top w:val="single" w:sz="4" w:space="0" w:color="999999"/>
-              <w:left w:val="single" w:sz="4" w:space="0" w:color="999999"/>
-              <w:bottom w:val="single" w:sz="4" w:space="0" w:color="999999"/>
-              <w:right w:val="single" w:sz="4" w:space="0" w:color="999999"/>
-            </w:tcBorders>
-            <w:shd w:val="clear" w:color="auto" w:fill="EEF2FA"/>
+            <w:tcW w:w="0" w:type="auto"/>
+            <w:tcMar>
+              <w:top w:w="75" w:type="dxa"/>
+              <w:left w:w="150" w:type="dxa"/>
+              <w:bottom w:w="75" w:type="dxa"/>
+              <w:right w:w="150" w:type="dxa"/>
+            </w:tcMar>
+            <w:vAlign w:val="center"/>
+            <w:hideMark/>
           </w:tcPr>
           <w:p>
+            <w:pPr>
+              <w:rPr>
+                <w:lang w:val="es-CO"/>
+              </w:rPr>
+            </w:pPr>
             <w:r>
               <w:rPr>
-                <w:sz w:val="19"/>
-              </w:rPr>
-              <w:t>O(log N)</w:t>
-            </w:r>
-          </w:p>
-        </w:tc>
-      </w:tr>
-      <w:tr>
-        <w:trPr>
-          <w:trHeight w:val="400"/>
-        </w:trPr>
-        <w:tc>
-          <w:tcPr>
-            <w:tcW w:w="2880" w:type="dxa"/>
-            <w:tcBorders>
-              <w:top w:val="single" w:sz="4" w:space="0" w:color="999999"/>
-              <w:left w:val="single" w:sz="4" w:space="0" w:color="999999"/>
-              <w:bottom w:val="single" w:sz="4" w:space="0" w:color="999999"/>
-              <w:right w:val="single" w:sz="4" w:space="0" w:color="999999"/>
-            </w:tcBorders>
-            <w:shd w:val="clear" w:color="auto" w:fill="FFFFFF"/>
-          </w:tcPr>
-          <w:p>
-            <w:r>
-              <w:rPr>
-                <w:sz w:val="19"/>
-              </w:rPr>
-              <w:t>get_min / get_max</w:t>
+                <w:lang w:val="es-CO"/>
+              </w:rPr>
+              <w:t>(O(N))</w:t>
             </w:r>
           </w:p>
         </w:tc>
         <w:tc>
           <w:tcPr>
-            <w:tcW w:w="2160" w:type="dxa"/>
-            <w:tcBorders>
-              <w:top w:val="single" w:sz="4" w:space="0" w:color="999999"/>
-              <w:left w:val="single" w:sz="4" w:space="0" w:color="999999"/>
-              <w:bottom w:val="single" w:sz="4" w:space="0" w:color="999999"/>
-              <w:right w:val="single" w:sz="4" w:space="0" w:color="999999"/>
-            </w:tcBorders>
-            <w:shd w:val="clear" w:color="auto" w:fill="FFFFFF"/>
+            <w:tcW w:w="0" w:type="auto"/>
+            <w:tcMar>
+              <w:top w:w="75" w:type="dxa"/>
+              <w:left w:w="150" w:type="dxa"/>
+              <w:bottom w:w="75" w:type="dxa"/>
+              <w:right w:w="150" w:type="dxa"/>
+            </w:tcMar>
+            <w:vAlign w:val="center"/>
+            <w:hideMark/>
           </w:tcPr>
           <w:p>
+            <w:pPr>
+              <w:rPr>
+                <w:lang w:val="es-CO"/>
+              </w:rPr>
+            </w:pPr>
             <w:r>
               <w:rPr>
-                <w:sz w:val="19"/>
-              </w:rPr>
-              <w:t>O(N)</w:t>
+                <w:lang w:val="es-CO"/>
+              </w:rPr>
+              <w:t>(</w:t>
+            </w:r>
+            <w:proofErr w:type="gramStart"/>
+            <w:r>
+              <w:rPr>
+                <w:lang w:val="es-CO"/>
+              </w:rPr>
+              <w:t>O(</w:t>
+            </w:r>
+            <w:proofErr w:type="gramEnd"/>
+            <w:r>
+              <w:rPr>
+                <w:lang w:val="es-CO"/>
+              </w:rPr>
+              <w:t>log N + k))</w:t>
             </w:r>
           </w:p>
         </w:tc>
         <w:tc>
           <w:tcPr>
-            <w:tcW w:w="2448" w:type="dxa"/>
-            <w:tcBorders>
-              <w:top w:val="single" w:sz="4" w:space="0" w:color="999999"/>
-              <w:left w:val="single" w:sz="4" w:space="0" w:color="999999"/>
-              <w:bottom w:val="single" w:sz="4" w:space="0" w:color="999999"/>
-              <w:right w:val="single" w:sz="4" w:space="0" w:color="999999"/>
-            </w:tcBorders>
-            <w:shd w:val="clear" w:color="auto" w:fill="FFFFFF"/>
+            <w:tcW w:w="0" w:type="auto"/>
+            <w:tcMar>
+              <w:top w:w="75" w:type="dxa"/>
+              <w:left w:w="150" w:type="dxa"/>
+              <w:bottom w:w="75" w:type="dxa"/>
+              <w:right w:w="150" w:type="dxa"/>
+            </w:tcMar>
+            <w:vAlign w:val="center"/>
+            <w:hideMark/>
           </w:tcPr>
           <w:p>
+            <w:pPr>
+              <w:rPr>
+                <w:lang w:val="es-CO"/>
+              </w:rPr>
+            </w:pPr>
             <w:r>
               <w:rPr>
-                <w:sz w:val="19"/>
-              </w:rPr>
-              <w:t>O(log N)</w:t>
+                <w:lang w:val="es-CO"/>
+              </w:rPr>
+              <w:t>(</w:t>
             </w:r>
-          </w:p>
-        </w:tc>
-        <w:tc>
-          <w:tcPr>
-            <w:tcW w:w="2160" w:type="dxa"/>
-            <w:tcBorders>
-              <w:top w:val="single" w:sz="4" w:space="0" w:color="999999"/>
-              <w:left w:val="single" w:sz="4" w:space="0" w:color="999999"/>
-              <w:bottom w:val="single" w:sz="4" w:space="0" w:color="999999"/>
-              <w:right w:val="single" w:sz="4" w:space="0" w:color="999999"/>
-            </w:tcBorders>
-            <w:shd w:val="clear" w:color="auto" w:fill="FFFFFF"/>
-          </w:tcPr>
-          <w:p>
+            <w:proofErr w:type="gramStart"/>
             <w:r>
               <w:rPr>
-                <w:sz w:val="19"/>
-              </w:rPr>
-              <w:t>O(log N)</w:t>
+                <w:lang w:val="es-CO"/>
+              </w:rPr>
+              <w:t>O(</w:t>
             </w:r>
-          </w:p>
-        </w:tc>
-      </w:tr>
-      <w:tr>
-        <w:trPr>
-          <w:trHeight w:val="400"/>
-        </w:trPr>
-        <w:tc>
-          <w:tcPr>
-            <w:tcW w:w="2880" w:type="dxa"/>
-            <w:tcBorders>
-              <w:top w:val="single" w:sz="4" w:space="0" w:color="999999"/>
-              <w:left w:val="single" w:sz="4" w:space="0" w:color="999999"/>
-              <w:bottom w:val="single" w:sz="4" w:space="0" w:color="999999"/>
-              <w:right w:val="single" w:sz="4" w:space="0" w:color="999999"/>
-            </w:tcBorders>
-            <w:shd w:val="clear" w:color="auto" w:fill="EEF2FA"/>
-          </w:tcPr>
-          <w:p>
+            <w:proofErr w:type="gramEnd"/>
             <w:r>
               <w:rPr>
-                <w:sz w:val="19"/>
-              </w:rPr>
-              <w:t>keys / values por rango</w:t>
-            </w:r>
-          </w:p>
-        </w:tc>
-        <w:tc>
-          <w:tcPr>
-            <w:tcW w:w="2160" w:type="dxa"/>
-            <w:tcBorders>
-              <w:top w:val="single" w:sz="4" w:space="0" w:color="999999"/>
-              <w:left w:val="single" w:sz="4" w:space="0" w:color="999999"/>
-              <w:bottom w:val="single" w:sz="4" w:space="0" w:color="999999"/>
-              <w:right w:val="single" w:sz="4" w:space="0" w:color="999999"/>
-            </w:tcBorders>
-            <w:shd w:val="clear" w:color="auto" w:fill="EEF2FA"/>
-          </w:tcPr>
-          <w:p>
-            <w:r>
-              <w:rPr>
-                <w:sz w:val="19"/>
-              </w:rPr>
-              <w:t>O(N)</w:t>
-            </w:r>
-          </w:p>
-        </w:tc>
-        <w:tc>
-          <w:tcPr>
-            <w:tcW w:w="2448" w:type="dxa"/>
-            <w:tcBorders>
-              <w:top w:val="single" w:sz="4" w:space="0" w:color="999999"/>
-              <w:left w:val="single" w:sz="4" w:space="0" w:color="999999"/>
-              <w:bottom w:val="single" w:sz="4" w:space="0" w:color="999999"/>
-              <w:right w:val="single" w:sz="4" w:space="0" w:color="999999"/>
-            </w:tcBorders>
-            <w:shd w:val="clear" w:color="auto" w:fill="EEF2FA"/>
-          </w:tcPr>
-          <w:p>
-            <w:r>
-              <w:rPr>
-                <w:sz w:val="19"/>
-              </w:rPr>
-              <w:t>O(log N + k)</w:t>
-            </w:r>
-          </w:p>
-        </w:tc>
-        <w:tc>
-          <w:tcPr>
-            <w:tcW w:w="2160" w:type="dxa"/>
-            <w:tcBorders>
-              <w:top w:val="single" w:sz="4" w:space="0" w:color="999999"/>
-              <w:left w:val="single" w:sz="4" w:space="0" w:color="999999"/>
-              <w:bottom w:val="single" w:sz="4" w:space="0" w:color="999999"/>
-              <w:right w:val="single" w:sz="4" w:space="0" w:color="999999"/>
-            </w:tcBorders>
-            <w:shd w:val="clear" w:color="auto" w:fill="EEF2FA"/>
-          </w:tcPr>
-          <w:p>
-            <w:r>
-              <w:rPr>
-                <w:sz w:val="19"/>
-              </w:rPr>
-              <w:t>O(log N + k)</w:t>
+                <w:lang w:val="es-CO"/>
+              </w:rPr>
+              <w:t>log N + k))</w:t>
             </w:r>
           </w:p>
         </w:tc>
@@ -1351,181 +1903,364 @@
     </w:tbl>
     <w:p>
       <w:pPr>
-        <w:spacing w:after="167" w:line="241" w:lineRule="auto"/>
-        <w:ind w:left="25"/>
-        <w:rPr>
-          <w:lang w:val="es-CO"/>
-        </w:rPr>
-      </w:pPr>
-      <w:r>
-        <w:rPr>
-          <w:lang w:val="es-CO"/>
-        </w:rPr>
-        <w:t xml:space="preserve">k es el número de llaves dentro del rango. El BST solo alcanza O(log N) en promedio si las llaves se insertan en un orden aleatorio; con datos ordenados o casi ordenados cae a O(N). El RBT garantiza O(log N) en el peor caso porque su altura está acotada por 2·log (N+1), sin importar el </w:t>
-      </w:r>
-      <w:r>
-        <w:rPr>
-          <w:sz w:val="17"/>
-          <w:lang w:val="es-CO"/>
-        </w:rPr>
-        <w:t xml:space="preserve">2 </w:t>
-      </w:r>
-      <w:r>
-        <w:rPr>
-          <w:lang w:val="es-CO"/>
-        </w:rPr>
-        <w:t>orden de inserción. Las rotaciones y flips de color de put son operaciones O(1) que se aplican a lo largo del camino de inserción, así que no cambian el orden de crecimiento.</w:t>
+        <w:rPr>
+          <w:lang w:val="es-CO"/>
+        </w:rPr>
+      </w:pPr>
+      <w:r>
+        <w:rPr>
+          <w:lang w:val="es-CO"/>
+        </w:rPr>
+        <w:t>Donde (k) representa el número de elementos encontrados dentro del rango.</w:t>
       </w:r>
     </w:p>
     <w:p>
       <w:pPr>
-        <w:spacing w:after="274"/>
-        <w:ind w:left="35"/>
-        <w:rPr>
-          <w:lang w:val="es-CO"/>
-        </w:rPr>
-      </w:pPr>
-      <w:r>
-        <w:rPr>
-          <w:lang w:val="es-CO"/>
-        </w:rPr>
-        <w:t>Para la carga completa, con M = 319073 crímenes, el costo total pasa de O(M·N) en el peor caso del BST a O(M·log N) en el RBT.</w:t>
+        <w:rPr>
+          <w:lang w:val="es-CO"/>
+        </w:rPr>
+      </w:pPr>
+      <w:r>
+        <w:rPr>
+          <w:lang w:val="es-CO"/>
+        </w:rPr>
+        <w:t>En el BST, si las llaves se insertan en un orden ordenado o casi ordenado, el árbol puede degenerarse y las operaciones pueden tener costo (O(N)).</w:t>
       </w:r>
     </w:p>
     <w:p>
       <w:pPr>
-        <w:spacing w:after="106"/>
-        <w:ind w:left="35"/>
-        <w:rPr>
-          <w:lang w:val="es-CO"/>
-        </w:rPr>
-      </w:pPr>
-      <w:r>
-        <w:rPr>
-          <w:rFonts w:ascii="Arial" w:eastAsia="Arial" w:hAnsi="Arial" w:cs="Arial"/>
-          <w:b/>
-          <w:color w:val="2F4F9E"/>
-          <w:sz w:val="25"/>
-          <w:lang w:val="es-CO"/>
-        </w:rPr>
-        <w:t>d. ¿Existe alguna manera de cargar los datos en un árbol RBT de tal forma que su funcionamiento mejore? Si es así, mencione cuál.</w:t>
+        <w:rPr>
+          <w:lang w:val="es-CO"/>
+        </w:rPr>
+      </w:pPr>
+      <w:r>
+        <w:rPr>
+          <w:lang w:val="es-CO"/>
+        </w:rPr>
+        <w:t>En el RBT, las rotaciones y los cambios de color garantizan que la altura permanezca logarítmica. Aunque cada inserción puede realizar trabajo adicional, dicho trabajo no cambia el orden de complejidad.</w:t>
       </w:r>
     </w:p>
     <w:p>
       <w:pPr>
-        <w:ind w:left="35"/>
-        <w:rPr>
-          <w:lang w:val="es-CO"/>
-        </w:rPr>
-      </w:pPr>
-      <w:r>
-        <w:rPr>
-          <w:lang w:val="es-CO"/>
-        </w:rPr>
-        <w:t>Sí. El orden de inserción no afecta la altura del RBT, pero sí se puede reducir el trabajo de la carga:</w:t>
+        <w:rPr>
+          <w:lang w:val="es-CO"/>
+        </w:rPr>
+      </w:pPr>
+      <w:r>
+        <w:rPr>
+          <w:lang w:val="es-CO"/>
+        </w:rPr>
+        <w:t>Para una carga de (M = 319073) crímenes y (N) llaves distintas, el costo de las operaciones sobre el índice es aproximadamente:</w:t>
       </w:r>
     </w:p>
     <w:p>
       <w:pPr>
         <w:numPr>
           <w:ilvl w:val="0"/>
-          <w:numId w:val="19"/>
+          <w:numId w:val="22"/>
         </w:numPr>
-        <w:spacing w:after="145" w:line="296" w:lineRule="auto"/>
-        <w:ind w:hanging="320"/>
-        <w:jc w:val="both"/>
-        <w:rPr>
-          <w:lang w:val="es-CO"/>
-        </w:rPr>
-      </w:pPr>
-      <w:r>
-        <w:rPr>
-          <w:rFonts w:ascii="Arial" w:eastAsia="Arial" w:hAnsi="Arial" w:cs="Arial"/>
-          <w:b/>
-          <w:lang w:val="es-CO"/>
-        </w:rPr>
-        <w:t>Agrupar antes de insertar.</w:t>
-      </w:r>
-      <w:r>
-        <w:rPr>
-          <w:lang w:val="es-CO"/>
-        </w:rPr>
-        <w:t xml:space="preserve"> Acumular los crímenes por llave en una tabla hash (por ejemplo, Separate Chaining o Linear Probing) y luego insertar en el RBT solo las llaves distintas. Así se hacen 1177 inserciones por fechas y 879 por áreas, en lugar de 319073 operaciones get y put sobre el árbol.</w:t>
+        <w:rPr>
+          <w:lang w:val="es-CO"/>
+        </w:rPr>
+      </w:pPr>
+      <w:r>
+        <w:rPr>
+          <w:lang w:val="es-CO"/>
+        </w:rPr>
+        <w:t>BST en el peor caso: (O(MN)).</w:t>
       </w:r>
     </w:p>
     <w:p>
       <w:pPr>
         <w:numPr>
           <w:ilvl w:val="0"/>
-          <w:numId w:val="19"/>
+          <w:numId w:val="22"/>
         </w:numPr>
-        <w:spacing w:after="145" w:line="296" w:lineRule="auto"/>
-        <w:ind w:hanging="320"/>
-        <w:jc w:val="both"/>
-        <w:rPr>
-          <w:lang w:val="es-CO"/>
-        </w:rPr>
-      </w:pPr>
-      <w:r>
-        <w:rPr>
-          <w:rFonts w:ascii="Arial" w:eastAsia="Arial" w:hAnsi="Arial" w:cs="Arial"/>
-          <w:b/>
-          <w:lang w:val="es-CO"/>
-        </w:rPr>
-        <w:t>Evitar el doble recorrido.</w:t>
-      </w:r>
-      <w:r>
-        <w:rPr>
-          <w:lang w:val="es-CO"/>
-        </w:rPr>
-        <w:t xml:space="preserve"> En add_crime y update_area_index se hace un get seguido de un put sobre la misma llave. Si la llave ya existe y el valor es una lista, basta con obtener la lista y agregarle el crimen, sin volver a llamar a put.</w:t>
+        <w:rPr>
+          <w:lang w:val="es-CO"/>
+        </w:rPr>
+      </w:pPr>
+      <w:r>
+        <w:rPr>
+          <w:lang w:val="es-CO"/>
+        </w:rPr>
+        <w:t>RBT en el peor caso: (</w:t>
+      </w:r>
+      <w:proofErr w:type="gramStart"/>
+      <w:r>
+        <w:rPr>
+          <w:lang w:val="es-CO"/>
+        </w:rPr>
+        <w:t>O(</w:t>
+      </w:r>
+      <w:proofErr w:type="gramEnd"/>
+      <w:r>
+        <w:rPr>
+          <w:lang w:val="es-CO"/>
+        </w:rPr>
+        <w:t>M</w:t>
+      </w:r>
+      <w:r>
+        <w:rPr>
+          <w:lang w:val="es-CO"/>
+        </w:rPr>
+        <w:t xml:space="preserve"> l</w:t>
+      </w:r>
+      <w:r>
+        <w:rPr>
+          <w:lang w:val="es-CO"/>
+        </w:rPr>
+        <w:t>og N)).</w:t>
       </w:r>
     </w:p>
     <w:p>
       <w:pPr>
+        <w:rPr>
+          <w:lang w:val="es-CO"/>
+        </w:rPr>
+      </w:pPr>
+      <w:r>
+        <w:rPr>
+          <w:lang w:val="es-CO"/>
+        </w:rPr>
+        <w:t>Por lo tanto, el RBT ofrece una garantía de rendimiento mucho mejor en el peor caso.</w:t>
+      </w:r>
+    </w:p>
+    <w:p>
+      <w:pPr>
+        <w:rPr>
+          <w:b/>
+          <w:bCs/>
+          <w:lang w:val="es-CO"/>
+        </w:rPr>
+      </w:pPr>
+      <w:r>
+        <w:rPr>
+          <w:b/>
+          <w:bCs/>
+          <w:lang w:val="es-CO"/>
+        </w:rPr>
+        <w:t>d. ¿Existe alguna manera de cargar los datos en un árbol RBT de tal forma que su funcionamiento mejore?</w:t>
+      </w:r>
+    </w:p>
+    <w:p>
+      <w:pPr>
+        <w:rPr>
+          <w:lang w:val="es-CO"/>
+        </w:rPr>
+      </w:pPr>
+      <w:r>
+        <w:rPr>
+          <w:lang w:val="es-CO"/>
+        </w:rPr>
+        <w:t>Sí. Aunque el RBT ya mantiene una altura balanceada, se puede mejorar el tiempo total de carga reduciendo el número de operaciones realizadas sobre el árbol.</w:t>
+      </w:r>
+    </w:p>
+    <w:p>
+      <w:pPr>
+        <w:rPr>
+          <w:lang w:val="es-CO"/>
+        </w:rPr>
+      </w:pPr>
+      <w:r>
+        <w:rPr>
+          <w:lang w:val="es-CO"/>
+        </w:rPr>
+        <w:t>Una primera estrategia consiste en agrupar previamente los crímenes por llave usando una tabla hash. De esta forma, primero se acumulan los crímenes por fecha y por área, y posteriormente se insertan en el RBT únicamente las llaves distintas.</w:t>
+      </w:r>
+    </w:p>
+    <w:p>
+      <w:pPr>
+        <w:rPr>
+          <w:lang w:val="es-CO"/>
+        </w:rPr>
+      </w:pPr>
+      <w:r>
+        <w:rPr>
+          <w:lang w:val="es-CO"/>
+        </w:rPr>
+        <w:t>En este caso, en lugar de realizar operaciones sobre el árbol para los 319073 crímenes, se realizarían aproximadamente:</w:t>
+      </w:r>
+    </w:p>
+    <w:p>
+      <w:pPr>
         <w:numPr>
           <w:ilvl w:val="0"/>
-          <w:numId w:val="19"/>
+          <w:numId w:val="23"/>
         </w:numPr>
-        <w:spacing w:after="192" w:line="296" w:lineRule="auto"/>
-        <w:jc w:val="both"/>
-        <w:rPr>
-          <w:lang w:val="es-CO"/>
-        </w:rPr>
-      </w:pPr>
-      <w:r>
-        <w:rPr>
-          <w:rFonts w:ascii="Arial" w:eastAsia="Arial" w:hAnsi="Arial" w:cs="Arial"/>
-          <w:b/>
-          <w:lang w:val="es-CO"/>
-        </w:rPr>
-        <w:t>Construcción desde datos ordenados.</w:t>
-      </w:r>
-      <w:r>
-        <w:rPr>
-          <w:lang w:val="es-CO"/>
-        </w:rPr>
-        <w:t xml:space="preserve"> Si las llaves distintas se ordenan primero (</w:t>
-      </w:r>
-      <w:proofErr w:type="gramStart"/>
-      <w:r>
-        <w:rPr>
-          <w:lang w:val="es-CO"/>
-        </w:rPr>
-        <w:t>O(</w:t>
-      </w:r>
-      <w:proofErr w:type="gramEnd"/>
-      <w:r>
-        <w:rPr>
-          <w:lang w:val="es-CO"/>
-        </w:rPr>
-        <w:t>K log K) con K llaves distintas), se puede construir el árbol directamente de forma balanceada en O(K), tomando el elemento central como raíz de manera recursiva y coloreando de negro todos los niveles salvo el último</w:t>
-      </w:r>
-      <w:r>
-        <w:rPr>
-          <w:lang w:val="es-ES"/>
-        </w:rPr>
-        <w:t xml:space="preserve">. </w:t>
+        <w:rPr>
+          <w:lang w:val="es-CO"/>
+        </w:rPr>
+      </w:pPr>
+      <w:r>
+        <w:rPr>
+          <w:lang w:val="es-CO"/>
+        </w:rPr>
+        <w:t>1177 inserciones para las fechas.</w:t>
+      </w:r>
+    </w:p>
+    <w:p>
+      <w:pPr>
+        <w:numPr>
+          <w:ilvl w:val="0"/>
+          <w:numId w:val="23"/>
+        </w:numPr>
+        <w:rPr>
+          <w:lang w:val="es-CO"/>
+        </w:rPr>
+      </w:pPr>
+      <w:r>
+        <w:rPr>
+          <w:lang w:val="es-CO"/>
+        </w:rPr>
+        <w:t>879 inserciones para las áreas.</w:t>
+      </w:r>
+    </w:p>
+    <w:p>
+      <w:pPr>
+        <w:rPr>
+          <w:lang w:val="es-CO"/>
+        </w:rPr>
+      </w:pPr>
+      <w:r>
+        <w:rPr>
+          <w:lang w:val="es-CO"/>
+        </w:rPr>
+        <w:t>Otra optimización consiste en evitar operaciones innecesarias de búsqueda e inserción. Cuando una llave ya existe en el árbol, no es necesario volver a ejecutar </w:t>
+      </w:r>
+      <w:proofErr w:type="spellStart"/>
+      <w:r>
+        <w:rPr>
+          <w:lang w:val="es-CO"/>
+        </w:rPr>
+        <w:t>put</w:t>
+      </w:r>
+      <w:proofErr w:type="spellEnd"/>
+      <w:r>
+        <w:rPr>
+          <w:lang w:val="es-CO"/>
+        </w:rPr>
+        <w:t>; basta con obtener la lista asociada y agregarle el nuevo crimen.</w:t>
+      </w:r>
+    </w:p>
+    <w:p>
+      <w:pPr>
+        <w:rPr>
+          <w:lang w:val="es-CO"/>
+        </w:rPr>
+      </w:pPr>
+      <w:r>
+        <w:rPr>
+          <w:lang w:val="es-CO"/>
+        </w:rPr>
+        <w:t>También se puede mejorar el proceso leyendo y procesando los datos en una sola pasada, manteniendo estructuras auxiliares para las fechas, áreas y tipos de ofensa.</w:t>
+      </w:r>
+    </w:p>
+    <w:p>
+      <w:pPr>
+        <w:rPr>
+          <w:lang w:val="es-CO"/>
+        </w:rPr>
+      </w:pPr>
+      <w:r>
+        <w:rPr>
+          <w:lang w:val="es-CO"/>
+        </w:rPr>
+        <w:t>Finalmente, si se dispone de todas las llaves antes de construir el índice, se pueden ordenar y construir un árbol balanceado de forma directa. Sin embargo, esta alternativa debe respetar las reglas de coloración del RBT, por lo que no basta simplemente con colorear todos los niveles de negro. La estrategia más sencilla y segura para este proyecto es agrupar primero los datos y luego insertar únicamente las llaves distintas en el RBT.</w:t>
+      </w:r>
+    </w:p>
+    <w:p>
+      <w:pPr>
+        <w:rPr>
+          <w:lang w:val="es-CO"/>
+        </w:rPr>
+      </w:pPr>
+      <w:r>
+        <w:rPr>
+          <w:lang w:val="es-CO"/>
+        </w:rPr>
+        <w:t>En conclusión, la mejora más práctica es:</w:t>
+      </w:r>
+    </w:p>
+    <w:p>
+      <w:pPr>
+        <w:numPr>
+          <w:ilvl w:val="0"/>
+          <w:numId w:val="24"/>
+        </w:numPr>
+        <w:rPr>
+          <w:lang w:val="es-CO"/>
+        </w:rPr>
+      </w:pPr>
+      <w:r>
+        <w:rPr>
+          <w:lang w:val="es-CO"/>
+        </w:rPr>
+        <w:t>Agrupar los crímenes por fecha y área.</w:t>
+      </w:r>
+    </w:p>
+    <w:p>
+      <w:pPr>
+        <w:numPr>
+          <w:ilvl w:val="0"/>
+          <w:numId w:val="24"/>
+        </w:numPr>
+        <w:rPr>
+          <w:lang w:val="es-CO"/>
+        </w:rPr>
+      </w:pPr>
+      <w:r>
+        <w:rPr>
+          <w:lang w:val="es-CO"/>
+        </w:rPr>
+        <w:t>Insertar en el RBT solo las llaves distintas.</w:t>
+      </w:r>
+    </w:p>
+    <w:p>
+      <w:pPr>
+        <w:numPr>
+          <w:ilvl w:val="0"/>
+          <w:numId w:val="24"/>
+        </w:numPr>
+        <w:rPr>
+          <w:lang w:val="es-CO"/>
+        </w:rPr>
+      </w:pPr>
+      <w:r>
+        <w:rPr>
+          <w:lang w:val="es-CO"/>
+        </w:rPr>
+        <w:t>Actualizar directamente las listas asociadas cuando la llave ya exista.</w:t>
+      </w:r>
+    </w:p>
+    <w:p>
+      <w:pPr>
+        <w:numPr>
+          <w:ilvl w:val="0"/>
+          <w:numId w:val="24"/>
+        </w:numPr>
+        <w:rPr>
+          <w:lang w:val="es-CO"/>
+        </w:rPr>
+      </w:pPr>
+      <w:r>
+        <w:rPr>
+          <w:lang w:val="es-CO"/>
+        </w:rPr>
+        <w:t>Evitar búsquedas y operaciones repetidas sobre el árbol.</w:t>
+      </w:r>
+    </w:p>
+    <w:p>
+      <w:pPr>
+        <w:rPr>
+          <w:lang w:val="es-CO"/>
+        </w:rPr>
+      </w:pPr>
+      <w:r>
+        <w:rPr>
+          <w:lang w:val="es-CO"/>
+        </w:rPr>
+        <w:t>Estas optimizaciones disminuyen el número de operaciones y reducen el tiempo total de carga sin cambiar la funcionalidad del índice.</w:t>
       </w:r>
     </w:p>
     <w:p>
@@ -2524,6 +3259,417 @@
     </w:lvl>
   </w:abstractNum>
   <w:abstractNum w:abstractNumId="8" w15:restartNumberingAfterBreak="0">
+    <w:nsid w:val="24354373"/>
+    <w:multiLevelType w:val="multilevel"/>
+    <w:tmpl w:val="A94428CA"/>
+    <w:lvl w:ilvl="0">
+      <w:start w:val="1"/>
+      <w:numFmt w:val="bullet"/>
+      <w:lvlText w:val=""/>
+      <w:lvlJc w:val="left"/>
+      <w:pPr>
+        <w:tabs>
+          <w:tab w:val="num" w:pos="720"/>
+        </w:tabs>
+        <w:ind w:left="720" w:hanging="360"/>
+      </w:pPr>
+      <w:rPr>
+        <w:rFonts w:ascii="Symbol" w:hAnsi="Symbol" w:hint="default"/>
+        <w:sz w:val="20"/>
+      </w:rPr>
+    </w:lvl>
+    <w:lvl w:ilvl="1" w:tentative="1">
+      <w:start w:val="1"/>
+      <w:numFmt w:val="bullet"/>
+      <w:lvlText w:val="o"/>
+      <w:lvlJc w:val="left"/>
+      <w:pPr>
+        <w:tabs>
+          <w:tab w:val="num" w:pos="1440"/>
+        </w:tabs>
+        <w:ind w:left="1440" w:hanging="360"/>
+      </w:pPr>
+      <w:rPr>
+        <w:rFonts w:ascii="Courier New" w:hAnsi="Courier New" w:hint="default"/>
+        <w:sz w:val="20"/>
+      </w:rPr>
+    </w:lvl>
+    <w:lvl w:ilvl="2" w:tentative="1">
+      <w:start w:val="1"/>
+      <w:numFmt w:val="bullet"/>
+      <w:lvlText w:val=""/>
+      <w:lvlJc w:val="left"/>
+      <w:pPr>
+        <w:tabs>
+          <w:tab w:val="num" w:pos="2160"/>
+        </w:tabs>
+        <w:ind w:left="2160" w:hanging="360"/>
+      </w:pPr>
+      <w:rPr>
+        <w:rFonts w:ascii="Wingdings" w:hAnsi="Wingdings" w:hint="default"/>
+        <w:sz w:val="20"/>
+      </w:rPr>
+    </w:lvl>
+    <w:lvl w:ilvl="3" w:tentative="1">
+      <w:start w:val="1"/>
+      <w:numFmt w:val="bullet"/>
+      <w:lvlText w:val=""/>
+      <w:lvlJc w:val="left"/>
+      <w:pPr>
+        <w:tabs>
+          <w:tab w:val="num" w:pos="2880"/>
+        </w:tabs>
+        <w:ind w:left="2880" w:hanging="360"/>
+      </w:pPr>
+      <w:rPr>
+        <w:rFonts w:ascii="Wingdings" w:hAnsi="Wingdings" w:hint="default"/>
+        <w:sz w:val="20"/>
+      </w:rPr>
+    </w:lvl>
+    <w:lvl w:ilvl="4" w:tentative="1">
+      <w:start w:val="1"/>
+      <w:numFmt w:val="bullet"/>
+      <w:lvlText w:val=""/>
+      <w:lvlJc w:val="left"/>
+      <w:pPr>
+        <w:tabs>
+          <w:tab w:val="num" w:pos="3600"/>
+        </w:tabs>
+        <w:ind w:left="3600" w:hanging="360"/>
+      </w:pPr>
+      <w:rPr>
+        <w:rFonts w:ascii="Wingdings" w:hAnsi="Wingdings" w:hint="default"/>
+        <w:sz w:val="20"/>
+      </w:rPr>
+    </w:lvl>
+    <w:lvl w:ilvl="5" w:tentative="1">
+      <w:start w:val="1"/>
+      <w:numFmt w:val="bullet"/>
+      <w:lvlText w:val=""/>
+      <w:lvlJc w:val="left"/>
+      <w:pPr>
+        <w:tabs>
+          <w:tab w:val="num" w:pos="4320"/>
+        </w:tabs>
+        <w:ind w:left="4320" w:hanging="360"/>
+      </w:pPr>
+      <w:rPr>
+        <w:rFonts w:ascii="Wingdings" w:hAnsi="Wingdings" w:hint="default"/>
+        <w:sz w:val="20"/>
+      </w:rPr>
+    </w:lvl>
+    <w:lvl w:ilvl="6" w:tentative="1">
+      <w:start w:val="1"/>
+      <w:numFmt w:val="bullet"/>
+      <w:lvlText w:val=""/>
+      <w:lvlJc w:val="left"/>
+      <w:pPr>
+        <w:tabs>
+          <w:tab w:val="num" w:pos="5040"/>
+        </w:tabs>
+        <w:ind w:left="5040" w:hanging="360"/>
+      </w:pPr>
+      <w:rPr>
+        <w:rFonts w:ascii="Wingdings" w:hAnsi="Wingdings" w:hint="default"/>
+        <w:sz w:val="20"/>
+      </w:rPr>
+    </w:lvl>
+    <w:lvl w:ilvl="7" w:tentative="1">
+      <w:start w:val="1"/>
+      <w:numFmt w:val="bullet"/>
+      <w:lvlText w:val=""/>
+      <w:lvlJc w:val="left"/>
+      <w:pPr>
+        <w:tabs>
+          <w:tab w:val="num" w:pos="5760"/>
+        </w:tabs>
+        <w:ind w:left="5760" w:hanging="360"/>
+      </w:pPr>
+      <w:rPr>
+        <w:rFonts w:ascii="Wingdings" w:hAnsi="Wingdings" w:hint="default"/>
+        <w:sz w:val="20"/>
+      </w:rPr>
+    </w:lvl>
+    <w:lvl w:ilvl="8" w:tentative="1">
+      <w:start w:val="1"/>
+      <w:numFmt w:val="bullet"/>
+      <w:lvlText w:val=""/>
+      <w:lvlJc w:val="left"/>
+      <w:pPr>
+        <w:tabs>
+          <w:tab w:val="num" w:pos="6480"/>
+        </w:tabs>
+        <w:ind w:left="6480" w:hanging="360"/>
+      </w:pPr>
+      <w:rPr>
+        <w:rFonts w:ascii="Wingdings" w:hAnsi="Wingdings" w:hint="default"/>
+        <w:sz w:val="20"/>
+      </w:rPr>
+    </w:lvl>
+  </w:abstractNum>
+  <w:abstractNum w:abstractNumId="9" w15:restartNumberingAfterBreak="0">
+    <w:nsid w:val="29A37DDB"/>
+    <w:multiLevelType w:val="multilevel"/>
+    <w:tmpl w:val="26B4398C"/>
+    <w:lvl w:ilvl="0">
+      <w:start w:val="1"/>
+      <w:numFmt w:val="decimal"/>
+      <w:lvlText w:val="%1."/>
+      <w:lvlJc w:val="left"/>
+      <w:pPr>
+        <w:tabs>
+          <w:tab w:val="num" w:pos="720"/>
+        </w:tabs>
+        <w:ind w:left="720" w:hanging="360"/>
+      </w:pPr>
+    </w:lvl>
+    <w:lvl w:ilvl="1" w:tentative="1">
+      <w:start w:val="1"/>
+      <w:numFmt w:val="decimal"/>
+      <w:lvlText w:val="%2."/>
+      <w:lvlJc w:val="left"/>
+      <w:pPr>
+        <w:tabs>
+          <w:tab w:val="num" w:pos="1440"/>
+        </w:tabs>
+        <w:ind w:left="1440" w:hanging="360"/>
+      </w:pPr>
+    </w:lvl>
+    <w:lvl w:ilvl="2" w:tentative="1">
+      <w:start w:val="1"/>
+      <w:numFmt w:val="decimal"/>
+      <w:lvlText w:val="%3."/>
+      <w:lvlJc w:val="left"/>
+      <w:pPr>
+        <w:tabs>
+          <w:tab w:val="num" w:pos="2160"/>
+        </w:tabs>
+        <w:ind w:left="2160" w:hanging="360"/>
+      </w:pPr>
+    </w:lvl>
+    <w:lvl w:ilvl="3" w:tentative="1">
+      <w:start w:val="1"/>
+      <w:numFmt w:val="decimal"/>
+      <w:lvlText w:val="%4."/>
+      <w:lvlJc w:val="left"/>
+      <w:pPr>
+        <w:tabs>
+          <w:tab w:val="num" w:pos="2880"/>
+        </w:tabs>
+        <w:ind w:left="2880" w:hanging="360"/>
+      </w:pPr>
+    </w:lvl>
+    <w:lvl w:ilvl="4" w:tentative="1">
+      <w:start w:val="1"/>
+      <w:numFmt w:val="decimal"/>
+      <w:lvlText w:val="%5."/>
+      <w:lvlJc w:val="left"/>
+      <w:pPr>
+        <w:tabs>
+          <w:tab w:val="num" w:pos="3600"/>
+        </w:tabs>
+        <w:ind w:left="3600" w:hanging="360"/>
+      </w:pPr>
+    </w:lvl>
+    <w:lvl w:ilvl="5" w:tentative="1">
+      <w:start w:val="1"/>
+      <w:numFmt w:val="decimal"/>
+      <w:lvlText w:val="%6."/>
+      <w:lvlJc w:val="left"/>
+      <w:pPr>
+        <w:tabs>
+          <w:tab w:val="num" w:pos="4320"/>
+        </w:tabs>
+        <w:ind w:left="4320" w:hanging="360"/>
+      </w:pPr>
+    </w:lvl>
+    <w:lvl w:ilvl="6" w:tentative="1">
+      <w:start w:val="1"/>
+      <w:numFmt w:val="decimal"/>
+      <w:lvlText w:val="%7."/>
+      <w:lvlJc w:val="left"/>
+      <w:pPr>
+        <w:tabs>
+          <w:tab w:val="num" w:pos="5040"/>
+        </w:tabs>
+        <w:ind w:left="5040" w:hanging="360"/>
+      </w:pPr>
+    </w:lvl>
+    <w:lvl w:ilvl="7" w:tentative="1">
+      <w:start w:val="1"/>
+      <w:numFmt w:val="decimal"/>
+      <w:lvlText w:val="%8."/>
+      <w:lvlJc w:val="left"/>
+      <w:pPr>
+        <w:tabs>
+          <w:tab w:val="num" w:pos="5760"/>
+        </w:tabs>
+        <w:ind w:left="5760" w:hanging="360"/>
+      </w:pPr>
+    </w:lvl>
+    <w:lvl w:ilvl="8" w:tentative="1">
+      <w:start w:val="1"/>
+      <w:numFmt w:val="decimal"/>
+      <w:lvlText w:val="%9."/>
+      <w:lvlJc w:val="left"/>
+      <w:pPr>
+        <w:tabs>
+          <w:tab w:val="num" w:pos="6480"/>
+        </w:tabs>
+        <w:ind w:left="6480" w:hanging="360"/>
+      </w:pPr>
+    </w:lvl>
+  </w:abstractNum>
+  <w:abstractNum w:abstractNumId="10" w15:restartNumberingAfterBreak="0">
+    <w:nsid w:val="2ED1542C"/>
+    <w:multiLevelType w:val="multilevel"/>
+    <w:tmpl w:val="D362F800"/>
+    <w:lvl w:ilvl="0">
+      <w:start w:val="1"/>
+      <w:numFmt w:val="bullet"/>
+      <w:lvlText w:val=""/>
+      <w:lvlJc w:val="left"/>
+      <w:pPr>
+        <w:tabs>
+          <w:tab w:val="num" w:pos="720"/>
+        </w:tabs>
+        <w:ind w:left="720" w:hanging="360"/>
+      </w:pPr>
+      <w:rPr>
+        <w:rFonts w:ascii="Symbol" w:hAnsi="Symbol" w:hint="default"/>
+        <w:sz w:val="20"/>
+      </w:rPr>
+    </w:lvl>
+    <w:lvl w:ilvl="1" w:tentative="1">
+      <w:start w:val="1"/>
+      <w:numFmt w:val="bullet"/>
+      <w:lvlText w:val="o"/>
+      <w:lvlJc w:val="left"/>
+      <w:pPr>
+        <w:tabs>
+          <w:tab w:val="num" w:pos="1440"/>
+        </w:tabs>
+        <w:ind w:left="1440" w:hanging="360"/>
+      </w:pPr>
+      <w:rPr>
+        <w:rFonts w:ascii="Courier New" w:hAnsi="Courier New" w:hint="default"/>
+        <w:sz w:val="20"/>
+      </w:rPr>
+    </w:lvl>
+    <w:lvl w:ilvl="2" w:tentative="1">
+      <w:start w:val="1"/>
+      <w:numFmt w:val="bullet"/>
+      <w:lvlText w:val=""/>
+      <w:lvlJc w:val="left"/>
+      <w:pPr>
+        <w:tabs>
+          <w:tab w:val="num" w:pos="2160"/>
+        </w:tabs>
+        <w:ind w:left="2160" w:hanging="360"/>
+      </w:pPr>
+      <w:rPr>
+        <w:rFonts w:ascii="Wingdings" w:hAnsi="Wingdings" w:hint="default"/>
+        <w:sz w:val="20"/>
+      </w:rPr>
+    </w:lvl>
+    <w:lvl w:ilvl="3" w:tentative="1">
+      <w:start w:val="1"/>
+      <w:numFmt w:val="bullet"/>
+      <w:lvlText w:val=""/>
+      <w:lvlJc w:val="left"/>
+      <w:pPr>
+        <w:tabs>
+          <w:tab w:val="num" w:pos="2880"/>
+        </w:tabs>
+        <w:ind w:left="2880" w:hanging="360"/>
+      </w:pPr>
+      <w:rPr>
+        <w:rFonts w:ascii="Wingdings" w:hAnsi="Wingdings" w:hint="default"/>
+        <w:sz w:val="20"/>
+      </w:rPr>
+    </w:lvl>
+    <w:lvl w:ilvl="4" w:tentative="1">
+      <w:start w:val="1"/>
+      <w:numFmt w:val="bullet"/>
+      <w:lvlText w:val=""/>
+      <w:lvlJc w:val="left"/>
+      <w:pPr>
+        <w:tabs>
+          <w:tab w:val="num" w:pos="3600"/>
+        </w:tabs>
+        <w:ind w:left="3600" w:hanging="360"/>
+      </w:pPr>
+      <w:rPr>
+        <w:rFonts w:ascii="Wingdings" w:hAnsi="Wingdings" w:hint="default"/>
+        <w:sz w:val="20"/>
+      </w:rPr>
+    </w:lvl>
+    <w:lvl w:ilvl="5" w:tentative="1">
+      <w:start w:val="1"/>
+      <w:numFmt w:val="bullet"/>
+      <w:lvlText w:val=""/>
+      <w:lvlJc w:val="left"/>
+      <w:pPr>
+        <w:tabs>
+          <w:tab w:val="num" w:pos="4320"/>
+        </w:tabs>
+        <w:ind w:left="4320" w:hanging="360"/>
+      </w:pPr>
+      <w:rPr>
+        <w:rFonts w:ascii="Wingdings" w:hAnsi="Wingdings" w:hint="default"/>
+        <w:sz w:val="20"/>
+      </w:rPr>
+    </w:lvl>
+    <w:lvl w:ilvl="6" w:tentative="1">
+      <w:start w:val="1"/>
+      <w:numFmt w:val="bullet"/>
+      <w:lvlText w:val=""/>
+      <w:lvlJc w:val="left"/>
+      <w:pPr>
+        <w:tabs>
+          <w:tab w:val="num" w:pos="5040"/>
+        </w:tabs>
+        <w:ind w:left="5040" w:hanging="360"/>
+      </w:pPr>
+      <w:rPr>
+        <w:rFonts w:ascii="Wingdings" w:hAnsi="Wingdings" w:hint="default"/>
+        <w:sz w:val="20"/>
+      </w:rPr>
+    </w:lvl>
+    <w:lvl w:ilvl="7" w:tentative="1">
+      <w:start w:val="1"/>
+      <w:numFmt w:val="bullet"/>
+      <w:lvlText w:val=""/>
+      <w:lvlJc w:val="left"/>
+      <w:pPr>
+        <w:tabs>
+          <w:tab w:val="num" w:pos="5760"/>
+        </w:tabs>
+        <w:ind w:left="5760" w:hanging="360"/>
+      </w:pPr>
+      <w:rPr>
+        <w:rFonts w:ascii="Wingdings" w:hAnsi="Wingdings" w:hint="default"/>
+        <w:sz w:val="20"/>
+      </w:rPr>
+    </w:lvl>
+    <w:lvl w:ilvl="8" w:tentative="1">
+      <w:start w:val="1"/>
+      <w:numFmt w:val="bullet"/>
+      <w:lvlText w:val=""/>
+      <w:lvlJc w:val="left"/>
+      <w:pPr>
+        <w:tabs>
+          <w:tab w:val="num" w:pos="6480"/>
+        </w:tabs>
+        <w:ind w:left="6480" w:hanging="360"/>
+      </w:pPr>
+      <w:rPr>
+        <w:rFonts w:ascii="Wingdings" w:hAnsi="Wingdings" w:hint="default"/>
+        <w:sz w:val="20"/>
+      </w:rPr>
+    </w:lvl>
+  </w:abstractNum>
+  <w:abstractNum w:abstractNumId="11" w15:restartNumberingAfterBreak="0">
     <w:nsid w:val="321E58F7"/>
     <w:multiLevelType w:val="hybridMultilevel"/>
     <w:tmpl w:val="9F4C925E"/>
@@ -2609,7 +3755,7 @@
       </w:pPr>
     </w:lvl>
   </w:abstractNum>
-  <w:abstractNum w:abstractNumId="9" w15:restartNumberingAfterBreak="0">
+  <w:abstractNum w:abstractNumId="12" w15:restartNumberingAfterBreak="0">
     <w:nsid w:val="37777CB3"/>
     <w:multiLevelType w:val="hybridMultilevel"/>
     <w:tmpl w:val="211EC694"/>
@@ -2695,7 +3841,7 @@
       </w:pPr>
     </w:lvl>
   </w:abstractNum>
-  <w:abstractNum w:abstractNumId="10" w15:restartNumberingAfterBreak="0">
+  <w:abstractNum w:abstractNumId="13" w15:restartNumberingAfterBreak="0">
     <w:nsid w:val="38932BE3"/>
     <w:multiLevelType w:val="hybridMultilevel"/>
     <w:tmpl w:val="AB5C5FB8"/>
@@ -2907,7 +4053,7 @@
       </w:rPr>
     </w:lvl>
   </w:abstractNum>
-  <w:abstractNum w:abstractNumId="11" w15:restartNumberingAfterBreak="0">
+  <w:abstractNum w:abstractNumId="14" w15:restartNumberingAfterBreak="0">
     <w:nsid w:val="39826848"/>
     <w:multiLevelType w:val="hybridMultilevel"/>
     <w:tmpl w:val="4F165BD2"/>
@@ -2993,7 +4139,7 @@
       </w:pPr>
     </w:lvl>
   </w:abstractNum>
-  <w:abstractNum w:abstractNumId="12" w15:restartNumberingAfterBreak="0">
+  <w:abstractNum w:abstractNumId="15" w15:restartNumberingAfterBreak="0">
     <w:nsid w:val="40BD614B"/>
     <w:multiLevelType w:val="hybridMultilevel"/>
     <w:tmpl w:val="8C4CCDAE"/>
@@ -3214,7 +4360,7 @@
       </w:rPr>
     </w:lvl>
   </w:abstractNum>
-  <w:abstractNum w:abstractNumId="13" w15:restartNumberingAfterBreak="0">
+  <w:abstractNum w:abstractNumId="16" w15:restartNumberingAfterBreak="0">
     <w:nsid w:val="446D4DDB"/>
     <w:multiLevelType w:val="multilevel"/>
     <w:tmpl w:val="0409001D"/>
@@ -3327,7 +4473,7 @@
       </w:rPr>
     </w:lvl>
   </w:abstractNum>
-  <w:abstractNum w:abstractNumId="14" w15:restartNumberingAfterBreak="0">
+  <w:abstractNum w:abstractNumId="17" w15:restartNumberingAfterBreak="0">
     <w:nsid w:val="4723600A"/>
     <w:multiLevelType w:val="hybridMultilevel"/>
     <w:tmpl w:val="731ED4AE"/>
@@ -3413,7 +4559,7 @@
       </w:pPr>
     </w:lvl>
   </w:abstractNum>
-  <w:abstractNum w:abstractNumId="15" w15:restartNumberingAfterBreak="0">
+  <w:abstractNum w:abstractNumId="18" w15:restartNumberingAfterBreak="0">
     <w:nsid w:val="59085AB3"/>
     <w:multiLevelType w:val="hybridMultilevel"/>
     <w:tmpl w:val="7A268518"/>
@@ -3526,7 +4672,7 @@
       </w:rPr>
     </w:lvl>
   </w:abstractNum>
-  <w:abstractNum w:abstractNumId="16" w15:restartNumberingAfterBreak="0">
+  <w:abstractNum w:abstractNumId="19" w15:restartNumberingAfterBreak="0">
     <w:nsid w:val="5C974F57"/>
     <w:multiLevelType w:val="hybridMultilevel"/>
     <w:tmpl w:val="211EC694"/>
@@ -3612,7 +4758,7 @@
       </w:pPr>
     </w:lvl>
   </w:abstractNum>
-  <w:abstractNum w:abstractNumId="17" w15:restartNumberingAfterBreak="0">
+  <w:abstractNum w:abstractNumId="20" w15:restartNumberingAfterBreak="0">
     <w:nsid w:val="5EBA3F4E"/>
     <w:multiLevelType w:val="hybridMultilevel"/>
     <w:tmpl w:val="874CF82C"/>
@@ -3698,7 +4844,305 @@
       </w:pPr>
     </w:lvl>
   </w:abstractNum>
-  <w:abstractNum w:abstractNumId="18" w15:restartNumberingAfterBreak="0">
+  <w:abstractNum w:abstractNumId="21" w15:restartNumberingAfterBreak="0">
+    <w:nsid w:val="6AC97541"/>
+    <w:multiLevelType w:val="multilevel"/>
+    <w:tmpl w:val="13FCFAFC"/>
+    <w:lvl w:ilvl="0">
+      <w:start w:val="1"/>
+      <w:numFmt w:val="bullet"/>
+      <w:lvlText w:val=""/>
+      <w:lvlJc w:val="left"/>
+      <w:pPr>
+        <w:tabs>
+          <w:tab w:val="num" w:pos="720"/>
+        </w:tabs>
+        <w:ind w:left="720" w:hanging="360"/>
+      </w:pPr>
+      <w:rPr>
+        <w:rFonts w:ascii="Symbol" w:hAnsi="Symbol" w:hint="default"/>
+        <w:sz w:val="20"/>
+      </w:rPr>
+    </w:lvl>
+    <w:lvl w:ilvl="1" w:tentative="1">
+      <w:start w:val="1"/>
+      <w:numFmt w:val="bullet"/>
+      <w:lvlText w:val="o"/>
+      <w:lvlJc w:val="left"/>
+      <w:pPr>
+        <w:tabs>
+          <w:tab w:val="num" w:pos="1440"/>
+        </w:tabs>
+        <w:ind w:left="1440" w:hanging="360"/>
+      </w:pPr>
+      <w:rPr>
+        <w:rFonts w:ascii="Courier New" w:hAnsi="Courier New" w:hint="default"/>
+        <w:sz w:val="20"/>
+      </w:rPr>
+    </w:lvl>
+    <w:lvl w:ilvl="2" w:tentative="1">
+      <w:start w:val="1"/>
+      <w:numFmt w:val="bullet"/>
+      <w:lvlText w:val=""/>
+      <w:lvlJc w:val="left"/>
+      <w:pPr>
+        <w:tabs>
+          <w:tab w:val="num" w:pos="2160"/>
+        </w:tabs>
+        <w:ind w:left="2160" w:hanging="360"/>
+      </w:pPr>
+      <w:rPr>
+        <w:rFonts w:ascii="Wingdings" w:hAnsi="Wingdings" w:hint="default"/>
+        <w:sz w:val="20"/>
+      </w:rPr>
+    </w:lvl>
+    <w:lvl w:ilvl="3" w:tentative="1">
+      <w:start w:val="1"/>
+      <w:numFmt w:val="bullet"/>
+      <w:lvlText w:val=""/>
+      <w:lvlJc w:val="left"/>
+      <w:pPr>
+        <w:tabs>
+          <w:tab w:val="num" w:pos="2880"/>
+        </w:tabs>
+        <w:ind w:left="2880" w:hanging="360"/>
+      </w:pPr>
+      <w:rPr>
+        <w:rFonts w:ascii="Wingdings" w:hAnsi="Wingdings" w:hint="default"/>
+        <w:sz w:val="20"/>
+      </w:rPr>
+    </w:lvl>
+    <w:lvl w:ilvl="4" w:tentative="1">
+      <w:start w:val="1"/>
+      <w:numFmt w:val="bullet"/>
+      <w:lvlText w:val=""/>
+      <w:lvlJc w:val="left"/>
+      <w:pPr>
+        <w:tabs>
+          <w:tab w:val="num" w:pos="3600"/>
+        </w:tabs>
+        <w:ind w:left="3600" w:hanging="360"/>
+      </w:pPr>
+      <w:rPr>
+        <w:rFonts w:ascii="Wingdings" w:hAnsi="Wingdings" w:hint="default"/>
+        <w:sz w:val="20"/>
+      </w:rPr>
+    </w:lvl>
+    <w:lvl w:ilvl="5" w:tentative="1">
+      <w:start w:val="1"/>
+      <w:numFmt w:val="bullet"/>
+      <w:lvlText w:val=""/>
+      <w:lvlJc w:val="left"/>
+      <w:pPr>
+        <w:tabs>
+          <w:tab w:val="num" w:pos="4320"/>
+        </w:tabs>
+        <w:ind w:left="4320" w:hanging="360"/>
+      </w:pPr>
+      <w:rPr>
+        <w:rFonts w:ascii="Wingdings" w:hAnsi="Wingdings" w:hint="default"/>
+        <w:sz w:val="20"/>
+      </w:rPr>
+    </w:lvl>
+    <w:lvl w:ilvl="6" w:tentative="1">
+      <w:start w:val="1"/>
+      <w:numFmt w:val="bullet"/>
+      <w:lvlText w:val=""/>
+      <w:lvlJc w:val="left"/>
+      <w:pPr>
+        <w:tabs>
+          <w:tab w:val="num" w:pos="5040"/>
+        </w:tabs>
+        <w:ind w:left="5040" w:hanging="360"/>
+      </w:pPr>
+      <w:rPr>
+        <w:rFonts w:ascii="Wingdings" w:hAnsi="Wingdings" w:hint="default"/>
+        <w:sz w:val="20"/>
+      </w:rPr>
+    </w:lvl>
+    <w:lvl w:ilvl="7" w:tentative="1">
+      <w:start w:val="1"/>
+      <w:numFmt w:val="bullet"/>
+      <w:lvlText w:val=""/>
+      <w:lvlJc w:val="left"/>
+      <w:pPr>
+        <w:tabs>
+          <w:tab w:val="num" w:pos="5760"/>
+        </w:tabs>
+        <w:ind w:left="5760" w:hanging="360"/>
+      </w:pPr>
+      <w:rPr>
+        <w:rFonts w:ascii="Wingdings" w:hAnsi="Wingdings" w:hint="default"/>
+        <w:sz w:val="20"/>
+      </w:rPr>
+    </w:lvl>
+    <w:lvl w:ilvl="8" w:tentative="1">
+      <w:start w:val="1"/>
+      <w:numFmt w:val="bullet"/>
+      <w:lvlText w:val=""/>
+      <w:lvlJc w:val="left"/>
+      <w:pPr>
+        <w:tabs>
+          <w:tab w:val="num" w:pos="6480"/>
+        </w:tabs>
+        <w:ind w:left="6480" w:hanging="360"/>
+      </w:pPr>
+      <w:rPr>
+        <w:rFonts w:ascii="Wingdings" w:hAnsi="Wingdings" w:hint="default"/>
+        <w:sz w:val="20"/>
+      </w:rPr>
+    </w:lvl>
+  </w:abstractNum>
+  <w:abstractNum w:abstractNumId="22" w15:restartNumberingAfterBreak="0">
+    <w:nsid w:val="702E685B"/>
+    <w:multiLevelType w:val="multilevel"/>
+    <w:tmpl w:val="652473E8"/>
+    <w:lvl w:ilvl="0">
+      <w:start w:val="1"/>
+      <w:numFmt w:val="bullet"/>
+      <w:lvlText w:val=""/>
+      <w:lvlJc w:val="left"/>
+      <w:pPr>
+        <w:tabs>
+          <w:tab w:val="num" w:pos="720"/>
+        </w:tabs>
+        <w:ind w:left="720" w:hanging="360"/>
+      </w:pPr>
+      <w:rPr>
+        <w:rFonts w:ascii="Symbol" w:hAnsi="Symbol" w:hint="default"/>
+        <w:sz w:val="20"/>
+      </w:rPr>
+    </w:lvl>
+    <w:lvl w:ilvl="1" w:tentative="1">
+      <w:start w:val="1"/>
+      <w:numFmt w:val="bullet"/>
+      <w:lvlText w:val="o"/>
+      <w:lvlJc w:val="left"/>
+      <w:pPr>
+        <w:tabs>
+          <w:tab w:val="num" w:pos="1440"/>
+        </w:tabs>
+        <w:ind w:left="1440" w:hanging="360"/>
+      </w:pPr>
+      <w:rPr>
+        <w:rFonts w:ascii="Courier New" w:hAnsi="Courier New" w:hint="default"/>
+        <w:sz w:val="20"/>
+      </w:rPr>
+    </w:lvl>
+    <w:lvl w:ilvl="2" w:tentative="1">
+      <w:start w:val="1"/>
+      <w:numFmt w:val="bullet"/>
+      <w:lvlText w:val=""/>
+      <w:lvlJc w:val="left"/>
+      <w:pPr>
+        <w:tabs>
+          <w:tab w:val="num" w:pos="2160"/>
+        </w:tabs>
+        <w:ind w:left="2160" w:hanging="360"/>
+      </w:pPr>
+      <w:rPr>
+        <w:rFonts w:ascii="Wingdings" w:hAnsi="Wingdings" w:hint="default"/>
+        <w:sz w:val="20"/>
+      </w:rPr>
+    </w:lvl>
+    <w:lvl w:ilvl="3" w:tentative="1">
+      <w:start w:val="1"/>
+      <w:numFmt w:val="bullet"/>
+      <w:lvlText w:val=""/>
+      <w:lvlJc w:val="left"/>
+      <w:pPr>
+        <w:tabs>
+          <w:tab w:val="num" w:pos="2880"/>
+        </w:tabs>
+        <w:ind w:left="2880" w:hanging="360"/>
+      </w:pPr>
+      <w:rPr>
+        <w:rFonts w:ascii="Wingdings" w:hAnsi="Wingdings" w:hint="default"/>
+        <w:sz w:val="20"/>
+      </w:rPr>
+    </w:lvl>
+    <w:lvl w:ilvl="4" w:tentative="1">
+      <w:start w:val="1"/>
+      <w:numFmt w:val="bullet"/>
+      <w:lvlText w:val=""/>
+      <w:lvlJc w:val="left"/>
+      <w:pPr>
+        <w:tabs>
+          <w:tab w:val="num" w:pos="3600"/>
+        </w:tabs>
+        <w:ind w:left="3600" w:hanging="360"/>
+      </w:pPr>
+      <w:rPr>
+        <w:rFonts w:ascii="Wingdings" w:hAnsi="Wingdings" w:hint="default"/>
+        <w:sz w:val="20"/>
+      </w:rPr>
+    </w:lvl>
+    <w:lvl w:ilvl="5" w:tentative="1">
+      <w:start w:val="1"/>
+      <w:numFmt w:val="bullet"/>
+      <w:lvlText w:val=""/>
+      <w:lvlJc w:val="left"/>
+      <w:pPr>
+        <w:tabs>
+          <w:tab w:val="num" w:pos="4320"/>
+        </w:tabs>
+        <w:ind w:left="4320" w:hanging="360"/>
+      </w:pPr>
+      <w:rPr>
+        <w:rFonts w:ascii="Wingdings" w:hAnsi="Wingdings" w:hint="default"/>
+        <w:sz w:val="20"/>
+      </w:rPr>
+    </w:lvl>
+    <w:lvl w:ilvl="6" w:tentative="1">
+      <w:start w:val="1"/>
+      <w:numFmt w:val="bullet"/>
+      <w:lvlText w:val=""/>
+      <w:lvlJc w:val="left"/>
+      <w:pPr>
+        <w:tabs>
+          <w:tab w:val="num" w:pos="5040"/>
+        </w:tabs>
+        <w:ind w:left="5040" w:hanging="360"/>
+      </w:pPr>
+      <w:rPr>
+        <w:rFonts w:ascii="Wingdings" w:hAnsi="Wingdings" w:hint="default"/>
+        <w:sz w:val="20"/>
+      </w:rPr>
+    </w:lvl>
+    <w:lvl w:ilvl="7" w:tentative="1">
+      <w:start w:val="1"/>
+      <w:numFmt w:val="bullet"/>
+      <w:lvlText w:val=""/>
+      <w:lvlJc w:val="left"/>
+      <w:pPr>
+        <w:tabs>
+          <w:tab w:val="num" w:pos="5760"/>
+        </w:tabs>
+        <w:ind w:left="5760" w:hanging="360"/>
+      </w:pPr>
+      <w:rPr>
+        <w:rFonts w:ascii="Wingdings" w:hAnsi="Wingdings" w:hint="default"/>
+        <w:sz w:val="20"/>
+      </w:rPr>
+    </w:lvl>
+    <w:lvl w:ilvl="8" w:tentative="1">
+      <w:start w:val="1"/>
+      <w:numFmt w:val="bullet"/>
+      <w:lvlText w:val=""/>
+      <w:lvlJc w:val="left"/>
+      <w:pPr>
+        <w:tabs>
+          <w:tab w:val="num" w:pos="6480"/>
+        </w:tabs>
+        <w:ind w:left="6480" w:hanging="360"/>
+      </w:pPr>
+      <w:rPr>
+        <w:rFonts w:ascii="Wingdings" w:hAnsi="Wingdings" w:hint="default"/>
+        <w:sz w:val="20"/>
+      </w:rPr>
+    </w:lvl>
+  </w:abstractNum>
+  <w:abstractNum w:abstractNumId="23" w15:restartNumberingAfterBreak="0">
     <w:nsid w:val="7964390B"/>
     <w:multiLevelType w:val="hybridMultilevel"/>
     <w:tmpl w:val="26C01794"/>
@@ -3785,28 +5229,28 @@
     </w:lvl>
   </w:abstractNum>
   <w:num w:numId="1" w16cid:durableId="670062722">
-    <w:abstractNumId w:val="13"/>
+    <w:abstractNumId w:val="16"/>
   </w:num>
   <w:num w:numId="2" w16cid:durableId="738597953">
     <w:abstractNumId w:val="3"/>
   </w:num>
   <w:num w:numId="3" w16cid:durableId="1631740467">
-    <w:abstractNumId w:val="14"/>
+    <w:abstractNumId w:val="17"/>
   </w:num>
   <w:num w:numId="4" w16cid:durableId="635109986">
-    <w:abstractNumId w:val="17"/>
+    <w:abstractNumId w:val="20"/>
   </w:num>
   <w:num w:numId="5" w16cid:durableId="1050767660">
-    <w:abstractNumId w:val="18"/>
+    <w:abstractNumId w:val="23"/>
   </w:num>
   <w:num w:numId="6" w16cid:durableId="1216894168">
     <w:abstractNumId w:val="1"/>
   </w:num>
   <w:num w:numId="7" w16cid:durableId="1103187417">
-    <w:abstractNumId w:val="9"/>
+    <w:abstractNumId w:val="12"/>
   </w:num>
   <w:num w:numId="8" w16cid:durableId="1648702066">
-    <w:abstractNumId w:val="16"/>
+    <w:abstractNumId w:val="19"/>
   </w:num>
   <w:num w:numId="9" w16cid:durableId="554242314">
     <w:abstractNumId w:val="4"/>
@@ -3815,7 +5259,7 @@
     <w:abstractNumId w:val="7"/>
   </w:num>
   <w:num w:numId="11" w16cid:durableId="1059748020">
-    <w:abstractNumId w:val="15"/>
+    <w:abstractNumId w:val="18"/>
   </w:num>
   <w:num w:numId="12" w16cid:durableId="1140535429">
     <w:abstractNumId w:val="6"/>
@@ -3824,22 +5268,37 @@
     <w:abstractNumId w:val="5"/>
   </w:num>
   <w:num w:numId="14" w16cid:durableId="327904040">
-    <w:abstractNumId w:val="8"/>
+    <w:abstractNumId w:val="11"/>
   </w:num>
   <w:num w:numId="15" w16cid:durableId="1146320544">
     <w:abstractNumId w:val="0"/>
   </w:num>
   <w:num w:numId="16" w16cid:durableId="1543009604">
-    <w:abstractNumId w:val="11"/>
+    <w:abstractNumId w:val="14"/>
   </w:num>
   <w:num w:numId="17" w16cid:durableId="844903910">
-    <w:abstractNumId w:val="12"/>
+    <w:abstractNumId w:val="15"/>
   </w:num>
   <w:num w:numId="18" w16cid:durableId="2072002835">
     <w:abstractNumId w:val="2"/>
   </w:num>
   <w:num w:numId="19" w16cid:durableId="1673332608">
+    <w:abstractNumId w:val="13"/>
+  </w:num>
+  <w:num w:numId="20" w16cid:durableId="401685628">
+    <w:abstractNumId w:val="22"/>
+  </w:num>
+  <w:num w:numId="21" w16cid:durableId="501355129">
+    <w:abstractNumId w:val="8"/>
+  </w:num>
+  <w:num w:numId="22" w16cid:durableId="369500256">
+    <w:abstractNumId w:val="21"/>
+  </w:num>
+  <w:num w:numId="23" w16cid:durableId="1534732644">
     <w:abstractNumId w:val="10"/>
+  </w:num>
+  <w:num w:numId="24" w16cid:durableId="460390914">
+    <w:abstractNumId w:val="9"/>
   </w:num>
 </w:numbering>
 </file>
@@ -4290,7 +5749,6 @@
   <w:style w:type="character" w:default="1" w:styleId="DefaultParagraphFont">
     <w:name w:val="Default Paragraph Font"/>
     <w:uiPriority w:val="1"/>
-    <w:semiHidden/>
     <w:unhideWhenUsed/>
   </w:style>
   <w:style w:type="table" w:default="1" w:styleId="TableNormal">

</xml_diff>